<commit_message>
Switch font size from 11 to 10 in SCS and STACFIS template docs to match formatting convention
</commit_message>
<xml_diff>
--- a/inst/docx/SCS_template.docx
+++ b/inst/docx/SCS_template.docx
@@ -1,6 +1,6 @@
 
 <file path=word/document.xml><?xml version="1.0" encoding="utf-8"?>
-<w:document xmlns:wpc="http://schemas.microsoft.com/office/word/2010/wordprocessingCanvas" xmlns:cx="http://schemas.microsoft.com/office/drawing/2014/chartex" xmlns:cx1="http://schemas.microsoft.com/office/drawing/2015/9/8/chartex" xmlns:mc="http://schemas.openxmlformats.org/markup-compatibility/2006" xmlns:o="urn:schemas-microsoft-com:office:office" xmlns:r="http://schemas.openxmlformats.org/officeDocument/2006/relationships" xmlns:m="http://schemas.openxmlformats.org/officeDocument/2006/math" xmlns:v="urn:schemas-microsoft-com:vml" xmlns:wp14="http://schemas.microsoft.com/office/word/2010/wordprocessingDrawing" xmlns:wp="http://schemas.openxmlformats.org/drawingml/2006/wordprocessingDrawing" xmlns:w10="urn:schemas-microsoft-com:office:word" xmlns:w="http://schemas.openxmlformats.org/wordprocessingml/2006/main" xmlns:w14="http://schemas.microsoft.com/office/word/2010/wordml" xmlns:w15="http://schemas.microsoft.com/office/word/2012/wordml" xmlns:w16se="http://schemas.microsoft.com/office/word/2015/wordml/symex" xmlns:wpg="http://schemas.microsoft.com/office/word/2010/wordprocessingGroup" xmlns:wpi="http://schemas.microsoft.com/office/word/2010/wordprocessingInk" xmlns:wne="http://schemas.microsoft.com/office/word/2006/wordml" xmlns:wps="http://schemas.microsoft.com/office/word/2010/wordprocessingShape" mc:Ignorable="w14 w15 w16se wp14">
+<w:document xmlns:wpc="http://schemas.microsoft.com/office/word/2010/wordprocessingCanvas" xmlns:cx="http://schemas.microsoft.com/office/drawing/2014/chartex" xmlns:cx1="http://schemas.microsoft.com/office/drawing/2015/9/8/chartex" xmlns:cx2="http://schemas.microsoft.com/office/drawing/2015/10/21/chartex" xmlns:cx3="http://schemas.microsoft.com/office/drawing/2016/5/9/chartex" xmlns:cx4="http://schemas.microsoft.com/office/drawing/2016/5/10/chartex" xmlns:cx5="http://schemas.microsoft.com/office/drawing/2016/5/11/chartex" xmlns:cx6="http://schemas.microsoft.com/office/drawing/2016/5/12/chartex" xmlns:cx7="http://schemas.microsoft.com/office/drawing/2016/5/13/chartex" xmlns:cx8="http://schemas.microsoft.com/office/drawing/2016/5/14/chartex" xmlns:mc="http://schemas.openxmlformats.org/markup-compatibility/2006" xmlns:aink="http://schemas.microsoft.com/office/drawing/2016/ink" xmlns:am3d="http://schemas.microsoft.com/office/drawing/2017/model3d" xmlns:o="urn:schemas-microsoft-com:office:office" xmlns:oel="http://schemas.microsoft.com/office/2019/extlst" xmlns:r="http://schemas.openxmlformats.org/officeDocument/2006/relationships" xmlns:m="http://schemas.openxmlformats.org/officeDocument/2006/math" xmlns:v="urn:schemas-microsoft-com:vml" xmlns:wp14="http://schemas.microsoft.com/office/word/2010/wordprocessingDrawing" xmlns:wp="http://schemas.openxmlformats.org/drawingml/2006/wordprocessingDrawing" xmlns:w10="urn:schemas-microsoft-com:office:word" xmlns:w="http://schemas.openxmlformats.org/wordprocessingml/2006/main" xmlns:w14="http://schemas.microsoft.com/office/word/2010/wordml" xmlns:w15="http://schemas.microsoft.com/office/word/2012/wordml" xmlns:w16cex="http://schemas.microsoft.com/office/word/2018/wordml/cex" xmlns:w16cid="http://schemas.microsoft.com/office/word/2016/wordml/cid" xmlns:w16="http://schemas.microsoft.com/office/word/2018/wordml" xmlns:w16du="http://schemas.microsoft.com/office/word/2023/wordml/word16du" xmlns:w16sdtdh="http://schemas.microsoft.com/office/word/2020/wordml/sdtdatahash" xmlns:w16sdtfl="http://schemas.microsoft.com/office/word/2024/wordml/sdtformatlock" xmlns:w16se="http://schemas.microsoft.com/office/word/2015/wordml/symex" xmlns:wpg="http://schemas.microsoft.com/office/word/2010/wordprocessingGroup" xmlns:wpi="http://schemas.microsoft.com/office/word/2010/wordprocessingInk" xmlns:wne="http://schemas.microsoft.com/office/word/2006/wordml" xmlns:wps="http://schemas.microsoft.com/office/word/2010/wordprocessingShape" mc:Ignorable="w14 w15 w16se w16cid w16 w16cex w16sdtdh w16sdtfl w16du wp14">
   <w:body>
     <w:p>
       <w:pPr>
@@ -9,13 +9,13 @@
           <w:lang w:val="en-CA"/>
         </w:rPr>
       </w:pPr>
-      <w:bookmarkStart w:id="0" w:name="_GoBack"/>
-      <w:bookmarkEnd w:id="0"/>
     </w:p>
     <w:sectPr>
-      <w:headerReference w:type="default" r:id="rId11"/>
-      <w:footerReference w:type="default" r:id="rId12"/>
-      <w:footerReference w:type="first" r:id="rId13"/>
+      <w:headerReference w:type="even" r:id="rId11"/>
+      <w:headerReference w:type="default" r:id="rId12"/>
+      <w:footerReference w:type="default" r:id="rId13"/>
+      <w:headerReference w:type="first" r:id="rId14"/>
+      <w:footerReference w:type="first" r:id="rId15"/>
       <w:pgSz w:w="12240" w:h="15840"/>
       <w:pgMar w:top="1440" w:right="1440" w:bottom="1440" w:left="1440" w:header="720" w:footer="720" w:gutter="0"/>
       <w:cols w:space="720"/>
@@ -27,7 +27,7 @@
 </file>
 
 <file path=word/endnotes.xml><?xml version="1.0" encoding="utf-8"?>
-<w:endnotes xmlns:wpc="http://schemas.microsoft.com/office/word/2010/wordprocessingCanvas" xmlns:cx="http://schemas.microsoft.com/office/drawing/2014/chartex" xmlns:cx1="http://schemas.microsoft.com/office/drawing/2015/9/8/chartex" xmlns:mc="http://schemas.openxmlformats.org/markup-compatibility/2006" xmlns:o="urn:schemas-microsoft-com:office:office" xmlns:r="http://schemas.openxmlformats.org/officeDocument/2006/relationships" xmlns:m="http://schemas.openxmlformats.org/officeDocument/2006/math" xmlns:v="urn:schemas-microsoft-com:vml" xmlns:wp14="http://schemas.microsoft.com/office/word/2010/wordprocessingDrawing" xmlns:wp="http://schemas.openxmlformats.org/drawingml/2006/wordprocessingDrawing" xmlns:w10="urn:schemas-microsoft-com:office:word" xmlns:w="http://schemas.openxmlformats.org/wordprocessingml/2006/main" xmlns:w14="http://schemas.microsoft.com/office/word/2010/wordml" xmlns:w15="http://schemas.microsoft.com/office/word/2012/wordml" xmlns:w16se="http://schemas.microsoft.com/office/word/2015/wordml/symex" xmlns:wpg="http://schemas.microsoft.com/office/word/2010/wordprocessingGroup" xmlns:wpi="http://schemas.microsoft.com/office/word/2010/wordprocessingInk" xmlns:wne="http://schemas.microsoft.com/office/word/2006/wordml" xmlns:wps="http://schemas.microsoft.com/office/word/2010/wordprocessingShape" mc:Ignorable="w14 w15 w16se wp14">
+<w:endnotes xmlns:wpc="http://schemas.microsoft.com/office/word/2010/wordprocessingCanvas" xmlns:cx="http://schemas.microsoft.com/office/drawing/2014/chartex" xmlns:cx1="http://schemas.microsoft.com/office/drawing/2015/9/8/chartex" xmlns:cx2="http://schemas.microsoft.com/office/drawing/2015/10/21/chartex" xmlns:cx3="http://schemas.microsoft.com/office/drawing/2016/5/9/chartex" xmlns:cx4="http://schemas.microsoft.com/office/drawing/2016/5/10/chartex" xmlns:cx5="http://schemas.microsoft.com/office/drawing/2016/5/11/chartex" xmlns:cx6="http://schemas.microsoft.com/office/drawing/2016/5/12/chartex" xmlns:cx7="http://schemas.microsoft.com/office/drawing/2016/5/13/chartex" xmlns:cx8="http://schemas.microsoft.com/office/drawing/2016/5/14/chartex" xmlns:mc="http://schemas.openxmlformats.org/markup-compatibility/2006" xmlns:aink="http://schemas.microsoft.com/office/drawing/2016/ink" xmlns:am3d="http://schemas.microsoft.com/office/drawing/2017/model3d" xmlns:o="urn:schemas-microsoft-com:office:office" xmlns:oel="http://schemas.microsoft.com/office/2019/extlst" xmlns:r="http://schemas.openxmlformats.org/officeDocument/2006/relationships" xmlns:m="http://schemas.openxmlformats.org/officeDocument/2006/math" xmlns:v="urn:schemas-microsoft-com:vml" xmlns:wp14="http://schemas.microsoft.com/office/word/2010/wordprocessingDrawing" xmlns:wp="http://schemas.openxmlformats.org/drawingml/2006/wordprocessingDrawing" xmlns:w10="urn:schemas-microsoft-com:office:word" xmlns:w="http://schemas.openxmlformats.org/wordprocessingml/2006/main" xmlns:w14="http://schemas.microsoft.com/office/word/2010/wordml" xmlns:w15="http://schemas.microsoft.com/office/word/2012/wordml" xmlns:w16cex="http://schemas.microsoft.com/office/word/2018/wordml/cex" xmlns:w16cid="http://schemas.microsoft.com/office/word/2016/wordml/cid" xmlns:w16="http://schemas.microsoft.com/office/word/2018/wordml" xmlns:w16du="http://schemas.microsoft.com/office/word/2023/wordml/word16du" xmlns:w16sdtdh="http://schemas.microsoft.com/office/word/2020/wordml/sdtdatahash" xmlns:w16sdtfl="http://schemas.microsoft.com/office/word/2024/wordml/sdtformatlock" xmlns:w16se="http://schemas.microsoft.com/office/word/2015/wordml/symex" xmlns:wpg="http://schemas.microsoft.com/office/word/2010/wordprocessingGroup" xmlns:wpi="http://schemas.microsoft.com/office/word/2010/wordprocessingInk" xmlns:wne="http://schemas.microsoft.com/office/word/2006/wordml" xmlns:wps="http://schemas.microsoft.com/office/word/2010/wordprocessingShape" mc:Ignorable="w14 w15 w16se w16cid w16 w16cex w16sdtdh w16sdtfl w16du wp14">
   <w:endnote w:type="separator" w:id="-1">
     <w:p>
       <w:pPr>
@@ -52,7 +52,7 @@
 </file>
 
 <file path=word/footer1.xml><?xml version="1.0" encoding="utf-8"?>
-<w:ftr xmlns:wpc="http://schemas.microsoft.com/office/word/2010/wordprocessingCanvas" xmlns:cx="http://schemas.microsoft.com/office/drawing/2014/chartex" xmlns:cx1="http://schemas.microsoft.com/office/drawing/2015/9/8/chartex" xmlns:mc="http://schemas.openxmlformats.org/markup-compatibility/2006" xmlns:o="urn:schemas-microsoft-com:office:office" xmlns:r="http://schemas.openxmlformats.org/officeDocument/2006/relationships" xmlns:m="http://schemas.openxmlformats.org/officeDocument/2006/math" xmlns:v="urn:schemas-microsoft-com:vml" xmlns:wp14="http://schemas.microsoft.com/office/word/2010/wordprocessingDrawing" xmlns:wp="http://schemas.openxmlformats.org/drawingml/2006/wordprocessingDrawing" xmlns:w10="urn:schemas-microsoft-com:office:word" xmlns:w="http://schemas.openxmlformats.org/wordprocessingml/2006/main" xmlns:w14="http://schemas.microsoft.com/office/word/2010/wordml" xmlns:w15="http://schemas.microsoft.com/office/word/2012/wordml" xmlns:w16se="http://schemas.microsoft.com/office/word/2015/wordml/symex" xmlns:wpg="http://schemas.microsoft.com/office/word/2010/wordprocessingGroup" xmlns:wpi="http://schemas.microsoft.com/office/word/2010/wordprocessingInk" xmlns:wne="http://schemas.microsoft.com/office/word/2006/wordml" xmlns:wps="http://schemas.microsoft.com/office/word/2010/wordprocessingShape" mc:Ignorable="w14 w15 w16se wp14">
+<w:ftr xmlns:wpc="http://schemas.microsoft.com/office/word/2010/wordprocessingCanvas" xmlns:cx="http://schemas.microsoft.com/office/drawing/2014/chartex" xmlns:cx1="http://schemas.microsoft.com/office/drawing/2015/9/8/chartex" xmlns:cx2="http://schemas.microsoft.com/office/drawing/2015/10/21/chartex" xmlns:cx3="http://schemas.microsoft.com/office/drawing/2016/5/9/chartex" xmlns:cx4="http://schemas.microsoft.com/office/drawing/2016/5/10/chartex" xmlns:cx5="http://schemas.microsoft.com/office/drawing/2016/5/11/chartex" xmlns:cx6="http://schemas.microsoft.com/office/drawing/2016/5/12/chartex" xmlns:cx7="http://schemas.microsoft.com/office/drawing/2016/5/13/chartex" xmlns:cx8="http://schemas.microsoft.com/office/drawing/2016/5/14/chartex" xmlns:mc="http://schemas.openxmlformats.org/markup-compatibility/2006" xmlns:aink="http://schemas.microsoft.com/office/drawing/2016/ink" xmlns:am3d="http://schemas.microsoft.com/office/drawing/2017/model3d" xmlns:o="urn:schemas-microsoft-com:office:office" xmlns:oel="http://schemas.microsoft.com/office/2019/extlst" xmlns:r="http://schemas.openxmlformats.org/officeDocument/2006/relationships" xmlns:m="http://schemas.openxmlformats.org/officeDocument/2006/math" xmlns:v="urn:schemas-microsoft-com:vml" xmlns:wp14="http://schemas.microsoft.com/office/word/2010/wordprocessingDrawing" xmlns:wp="http://schemas.openxmlformats.org/drawingml/2006/wordprocessingDrawing" xmlns:w10="urn:schemas-microsoft-com:office:word" xmlns:w="http://schemas.openxmlformats.org/wordprocessingml/2006/main" xmlns:w14="http://schemas.microsoft.com/office/word/2010/wordml" xmlns:w15="http://schemas.microsoft.com/office/word/2012/wordml" xmlns:w16cex="http://schemas.microsoft.com/office/word/2018/wordml/cex" xmlns:w16cid="http://schemas.microsoft.com/office/word/2016/wordml/cid" xmlns:w16="http://schemas.microsoft.com/office/word/2018/wordml" xmlns:w16du="http://schemas.microsoft.com/office/word/2023/wordml/word16du" xmlns:w16sdtdh="http://schemas.microsoft.com/office/word/2020/wordml/sdtdatahash" xmlns:w16sdtfl="http://schemas.microsoft.com/office/word/2024/wordml/sdtformatlock" xmlns:w16se="http://schemas.microsoft.com/office/word/2015/wordml/symex" xmlns:wpg="http://schemas.microsoft.com/office/word/2010/wordprocessingGroup" xmlns:wpi="http://schemas.microsoft.com/office/word/2010/wordprocessingInk" xmlns:wne="http://schemas.microsoft.com/office/word/2006/wordml" xmlns:wps="http://schemas.microsoft.com/office/word/2010/wordprocessingShape" mc:Ignorable="w14 w15 w16se w16cid w16 w16cex w16sdtdh w16sdtfl w16du wp14">
   <w:p>
     <w:pPr>
       <w:tabs>
@@ -73,7 +73,7 @@
 </file>
 
 <file path=word/footer2.xml><?xml version="1.0" encoding="utf-8"?>
-<w:ftr xmlns:wpc="http://schemas.microsoft.com/office/word/2010/wordprocessingCanvas" xmlns:cx="http://schemas.microsoft.com/office/drawing/2014/chartex" xmlns:cx1="http://schemas.microsoft.com/office/drawing/2015/9/8/chartex" xmlns:mc="http://schemas.openxmlformats.org/markup-compatibility/2006" xmlns:o="urn:schemas-microsoft-com:office:office" xmlns:r="http://schemas.openxmlformats.org/officeDocument/2006/relationships" xmlns:m="http://schemas.openxmlformats.org/officeDocument/2006/math" xmlns:v="urn:schemas-microsoft-com:vml" xmlns:wp14="http://schemas.microsoft.com/office/word/2010/wordprocessingDrawing" xmlns:wp="http://schemas.openxmlformats.org/drawingml/2006/wordprocessingDrawing" xmlns:w10="urn:schemas-microsoft-com:office:word" xmlns:w="http://schemas.openxmlformats.org/wordprocessingml/2006/main" xmlns:w14="http://schemas.microsoft.com/office/word/2010/wordml" xmlns:w15="http://schemas.microsoft.com/office/word/2012/wordml" xmlns:w16se="http://schemas.microsoft.com/office/word/2015/wordml/symex" xmlns:wpg="http://schemas.microsoft.com/office/word/2010/wordprocessingGroup" xmlns:wpi="http://schemas.microsoft.com/office/word/2010/wordprocessingInk" xmlns:wne="http://schemas.microsoft.com/office/word/2006/wordml" xmlns:wps="http://schemas.microsoft.com/office/word/2010/wordprocessingShape" mc:Ignorable="w14 w15 w16se wp14">
+<w:ftr xmlns:wpc="http://schemas.microsoft.com/office/word/2010/wordprocessingCanvas" xmlns:cx="http://schemas.microsoft.com/office/drawing/2014/chartex" xmlns:cx1="http://schemas.microsoft.com/office/drawing/2015/9/8/chartex" xmlns:cx2="http://schemas.microsoft.com/office/drawing/2015/10/21/chartex" xmlns:cx3="http://schemas.microsoft.com/office/drawing/2016/5/9/chartex" xmlns:cx4="http://schemas.microsoft.com/office/drawing/2016/5/10/chartex" xmlns:cx5="http://schemas.microsoft.com/office/drawing/2016/5/11/chartex" xmlns:cx6="http://schemas.microsoft.com/office/drawing/2016/5/12/chartex" xmlns:cx7="http://schemas.microsoft.com/office/drawing/2016/5/13/chartex" xmlns:cx8="http://schemas.microsoft.com/office/drawing/2016/5/14/chartex" xmlns:mc="http://schemas.openxmlformats.org/markup-compatibility/2006" xmlns:aink="http://schemas.microsoft.com/office/drawing/2016/ink" xmlns:am3d="http://schemas.microsoft.com/office/drawing/2017/model3d" xmlns:o="urn:schemas-microsoft-com:office:office" xmlns:oel="http://schemas.microsoft.com/office/2019/extlst" xmlns:r="http://schemas.openxmlformats.org/officeDocument/2006/relationships" xmlns:m="http://schemas.openxmlformats.org/officeDocument/2006/math" xmlns:v="urn:schemas-microsoft-com:vml" xmlns:wp14="http://schemas.microsoft.com/office/word/2010/wordprocessingDrawing" xmlns:wp="http://schemas.openxmlformats.org/drawingml/2006/wordprocessingDrawing" xmlns:w10="urn:schemas-microsoft-com:office:word" xmlns:w="http://schemas.openxmlformats.org/wordprocessingml/2006/main" xmlns:w14="http://schemas.microsoft.com/office/word/2010/wordml" xmlns:w15="http://schemas.microsoft.com/office/word/2012/wordml" xmlns:w16cex="http://schemas.microsoft.com/office/word/2018/wordml/cex" xmlns:w16cid="http://schemas.microsoft.com/office/word/2016/wordml/cid" xmlns:w16="http://schemas.microsoft.com/office/word/2018/wordml" xmlns:w16du="http://schemas.microsoft.com/office/word/2023/wordml/word16du" xmlns:w16sdtdh="http://schemas.microsoft.com/office/word/2020/wordml/sdtdatahash" xmlns:w16sdtfl="http://schemas.microsoft.com/office/word/2024/wordml/sdtformatlock" xmlns:w16se="http://schemas.microsoft.com/office/word/2015/wordml/symex" xmlns:wpg="http://schemas.microsoft.com/office/word/2010/wordprocessingGroup" xmlns:wpi="http://schemas.microsoft.com/office/word/2010/wordprocessingInk" xmlns:wne="http://schemas.microsoft.com/office/word/2006/wordml" xmlns:wps="http://schemas.microsoft.com/office/word/2010/wordprocessingShape" mc:Ignorable="w14 w15 w16se w16cid w16 w16cex w16sdtdh w16sdtfl w16du wp14">
   <w:p>
     <w:pPr>
       <w:tabs>
@@ -95,7 +95,7 @@
 </file>
 
 <file path=word/footnotes.xml><?xml version="1.0" encoding="utf-8"?>
-<w:footnotes xmlns:wpc="http://schemas.microsoft.com/office/word/2010/wordprocessingCanvas" xmlns:cx="http://schemas.microsoft.com/office/drawing/2014/chartex" xmlns:cx1="http://schemas.microsoft.com/office/drawing/2015/9/8/chartex" xmlns:mc="http://schemas.openxmlformats.org/markup-compatibility/2006" xmlns:o="urn:schemas-microsoft-com:office:office" xmlns:r="http://schemas.openxmlformats.org/officeDocument/2006/relationships" xmlns:m="http://schemas.openxmlformats.org/officeDocument/2006/math" xmlns:v="urn:schemas-microsoft-com:vml" xmlns:wp14="http://schemas.microsoft.com/office/word/2010/wordprocessingDrawing" xmlns:wp="http://schemas.openxmlformats.org/drawingml/2006/wordprocessingDrawing" xmlns:w10="urn:schemas-microsoft-com:office:word" xmlns:w="http://schemas.openxmlformats.org/wordprocessingml/2006/main" xmlns:w14="http://schemas.microsoft.com/office/word/2010/wordml" xmlns:w15="http://schemas.microsoft.com/office/word/2012/wordml" xmlns:w16se="http://schemas.microsoft.com/office/word/2015/wordml/symex" xmlns:wpg="http://schemas.microsoft.com/office/word/2010/wordprocessingGroup" xmlns:wpi="http://schemas.microsoft.com/office/word/2010/wordprocessingInk" xmlns:wne="http://schemas.microsoft.com/office/word/2006/wordml" xmlns:wps="http://schemas.microsoft.com/office/word/2010/wordprocessingShape" mc:Ignorable="w14 w15 w16se wp14">
+<w:footnotes xmlns:wpc="http://schemas.microsoft.com/office/word/2010/wordprocessingCanvas" xmlns:cx="http://schemas.microsoft.com/office/drawing/2014/chartex" xmlns:cx1="http://schemas.microsoft.com/office/drawing/2015/9/8/chartex" xmlns:cx2="http://schemas.microsoft.com/office/drawing/2015/10/21/chartex" xmlns:cx3="http://schemas.microsoft.com/office/drawing/2016/5/9/chartex" xmlns:cx4="http://schemas.microsoft.com/office/drawing/2016/5/10/chartex" xmlns:cx5="http://schemas.microsoft.com/office/drawing/2016/5/11/chartex" xmlns:cx6="http://schemas.microsoft.com/office/drawing/2016/5/12/chartex" xmlns:cx7="http://schemas.microsoft.com/office/drawing/2016/5/13/chartex" xmlns:cx8="http://schemas.microsoft.com/office/drawing/2016/5/14/chartex" xmlns:mc="http://schemas.openxmlformats.org/markup-compatibility/2006" xmlns:aink="http://schemas.microsoft.com/office/drawing/2016/ink" xmlns:am3d="http://schemas.microsoft.com/office/drawing/2017/model3d" xmlns:o="urn:schemas-microsoft-com:office:office" xmlns:oel="http://schemas.microsoft.com/office/2019/extlst" xmlns:r="http://schemas.openxmlformats.org/officeDocument/2006/relationships" xmlns:m="http://schemas.openxmlformats.org/officeDocument/2006/math" xmlns:v="urn:schemas-microsoft-com:vml" xmlns:wp14="http://schemas.microsoft.com/office/word/2010/wordprocessingDrawing" xmlns:wp="http://schemas.openxmlformats.org/drawingml/2006/wordprocessingDrawing" xmlns:w10="urn:schemas-microsoft-com:office:word" xmlns:w="http://schemas.openxmlformats.org/wordprocessingml/2006/main" xmlns:w14="http://schemas.microsoft.com/office/word/2010/wordml" xmlns:w15="http://schemas.microsoft.com/office/word/2012/wordml" xmlns:w16cex="http://schemas.microsoft.com/office/word/2018/wordml/cex" xmlns:w16cid="http://schemas.microsoft.com/office/word/2016/wordml/cid" xmlns:w16="http://schemas.microsoft.com/office/word/2018/wordml" xmlns:w16du="http://schemas.microsoft.com/office/word/2023/wordml/word16du" xmlns:w16sdtdh="http://schemas.microsoft.com/office/word/2020/wordml/sdtdatahash" xmlns:w16sdtfl="http://schemas.microsoft.com/office/word/2024/wordml/sdtformatlock" xmlns:w16se="http://schemas.microsoft.com/office/word/2015/wordml/symex" xmlns:wpg="http://schemas.microsoft.com/office/word/2010/wordprocessingGroup" xmlns:wpi="http://schemas.microsoft.com/office/word/2010/wordprocessingInk" xmlns:wne="http://schemas.microsoft.com/office/word/2006/wordml" xmlns:wps="http://schemas.microsoft.com/office/word/2010/wordprocessingShape" mc:Ignorable="w14 w15 w16se w16cid w16 w16cex w16sdtdh w16sdtfl w16du wp14">
   <w:footnote w:type="separator" w:id="-1">
     <w:p>
       <w:r>
@@ -114,7 +114,260 @@
 </file>
 
 <file path=word/header1.xml><?xml version="1.0" encoding="utf-8"?>
-<w:hdr xmlns:wpc="http://schemas.microsoft.com/office/word/2010/wordprocessingCanvas" xmlns:cx="http://schemas.microsoft.com/office/drawing/2014/chartex" xmlns:cx1="http://schemas.microsoft.com/office/drawing/2015/9/8/chartex" xmlns:mc="http://schemas.openxmlformats.org/markup-compatibility/2006" xmlns:o="urn:schemas-microsoft-com:office:office" xmlns:r="http://schemas.openxmlformats.org/officeDocument/2006/relationships" xmlns:m="http://schemas.openxmlformats.org/officeDocument/2006/math" xmlns:v="urn:schemas-microsoft-com:vml" xmlns:wp14="http://schemas.microsoft.com/office/word/2010/wordprocessingDrawing" xmlns:wp="http://schemas.openxmlformats.org/drawingml/2006/wordprocessingDrawing" xmlns:w10="urn:schemas-microsoft-com:office:word" xmlns:w="http://schemas.openxmlformats.org/wordprocessingml/2006/main" xmlns:w14="http://schemas.microsoft.com/office/word/2010/wordml" xmlns:w15="http://schemas.microsoft.com/office/word/2012/wordml" xmlns:w16se="http://schemas.microsoft.com/office/word/2015/wordml/symex" xmlns:wpg="http://schemas.microsoft.com/office/word/2010/wordprocessingGroup" xmlns:wpi="http://schemas.microsoft.com/office/word/2010/wordprocessingInk" xmlns:wne="http://schemas.microsoft.com/office/word/2006/wordml" xmlns:wps="http://schemas.microsoft.com/office/word/2010/wordprocessingShape" mc:Ignorable="w14 w15 w16se wp14">
+<w:hdr xmlns:wpc="http://schemas.microsoft.com/office/word/2010/wordprocessingCanvas" xmlns:cx="http://schemas.microsoft.com/office/drawing/2014/chartex" xmlns:cx1="http://schemas.microsoft.com/office/drawing/2015/9/8/chartex" xmlns:cx2="http://schemas.microsoft.com/office/drawing/2015/10/21/chartex" xmlns:cx3="http://schemas.microsoft.com/office/drawing/2016/5/9/chartex" xmlns:cx4="http://schemas.microsoft.com/office/drawing/2016/5/10/chartex" xmlns:cx5="http://schemas.microsoft.com/office/drawing/2016/5/11/chartex" xmlns:cx6="http://schemas.microsoft.com/office/drawing/2016/5/12/chartex" xmlns:cx7="http://schemas.microsoft.com/office/drawing/2016/5/13/chartex" xmlns:cx8="http://schemas.microsoft.com/office/drawing/2016/5/14/chartex" xmlns:mc="http://schemas.openxmlformats.org/markup-compatibility/2006" xmlns:aink="http://schemas.microsoft.com/office/drawing/2016/ink" xmlns:am3d="http://schemas.microsoft.com/office/drawing/2017/model3d" xmlns:o="urn:schemas-microsoft-com:office:office" xmlns:oel="http://schemas.microsoft.com/office/2019/extlst" xmlns:r="http://schemas.openxmlformats.org/officeDocument/2006/relationships" xmlns:m="http://schemas.openxmlformats.org/officeDocument/2006/math" xmlns:v="urn:schemas-microsoft-com:vml" xmlns:wp14="http://schemas.microsoft.com/office/word/2010/wordprocessingDrawing" xmlns:wp="http://schemas.openxmlformats.org/drawingml/2006/wordprocessingDrawing" xmlns:w10="urn:schemas-microsoft-com:office:word" xmlns:w="http://schemas.openxmlformats.org/wordprocessingml/2006/main" xmlns:w14="http://schemas.microsoft.com/office/word/2010/wordml" xmlns:w15="http://schemas.microsoft.com/office/word/2012/wordml" xmlns:w16cex="http://schemas.microsoft.com/office/word/2018/wordml/cex" xmlns:w16cid="http://schemas.microsoft.com/office/word/2016/wordml/cid" xmlns:w16="http://schemas.microsoft.com/office/word/2018/wordml" xmlns:w16du="http://schemas.microsoft.com/office/word/2023/wordml/word16du" xmlns:w16sdtdh="http://schemas.microsoft.com/office/word/2020/wordml/sdtdatahash" xmlns:w16sdtfl="http://schemas.microsoft.com/office/word/2024/wordml/sdtformatlock" xmlns:w16se="http://schemas.microsoft.com/office/word/2015/wordml/symex" xmlns:wpg="http://schemas.microsoft.com/office/word/2010/wordprocessingGroup" xmlns:wpi="http://schemas.microsoft.com/office/word/2010/wordprocessingInk" xmlns:wne="http://schemas.microsoft.com/office/word/2006/wordml" xmlns:wps="http://schemas.microsoft.com/office/word/2010/wordprocessingShape" mc:Ignorable="w14 w15 w16se w16cid w16 w16cex w16sdtdh w16sdtfl w16du wp14">
+  <w:p>
+    <w:pPr>
+      <w:pStyle w:val="Header"/>
+    </w:pPr>
+    <w:r>
+      <w:rPr>
+        <w:noProof/>
+      </w:rPr>
+      <mc:AlternateContent>
+        <mc:Choice Requires="wps">
+          <w:drawing>
+            <wp:anchor distT="0" distB="0" distL="0" distR="0" simplePos="0" relativeHeight="251659264" behindDoc="0" locked="0" layoutInCell="1" allowOverlap="1" wp14:anchorId="27931B58" wp14:editId="036A0373">
+              <wp:simplePos x="635" y="635"/>
+              <wp:positionH relativeFrom="page">
+                <wp:align>right</wp:align>
+              </wp:positionH>
+              <wp:positionV relativeFrom="page">
+                <wp:align>top</wp:align>
+              </wp:positionV>
+              <wp:extent cx="1917700" cy="376555"/>
+              <wp:effectExtent l="0" t="0" r="0" b="4445"/>
+              <wp:wrapNone/>
+              <wp:docPr id="21593693" name="Text Box 2" descr="Unclassified - Non-Classifié">
+                <a:extLst xmlns:a="http://schemas.openxmlformats.org/drawingml/2006/main">
+                  <a:ext uri="{5AE41FA2-C0FF-4470-9BD4-5FADCA87CBE2}">
+                    <aclsh:classification xmlns:aclsh="http://schemas.microsoft.com/office/drawing/2020/classificationShape" classificationOutcomeType="hdr"/>
+                  </a:ext>
+                </a:extLst>
+              </wp:docPr>
+              <wp:cNvGraphicFramePr/>
+              <a:graphic xmlns:a="http://schemas.openxmlformats.org/drawingml/2006/main">
+                <a:graphicData uri="http://schemas.microsoft.com/office/word/2010/wordprocessingShape">
+                  <wps:wsp>
+                    <wps:cNvSpPr txBox="1"/>
+                    <wps:spPr>
+                      <a:xfrm>
+                        <a:off x="0" y="0"/>
+                        <a:ext cx="1917700" cy="376555"/>
+                      </a:xfrm>
+                      <a:prstGeom prst="rect">
+                        <a:avLst/>
+                      </a:prstGeom>
+                      <a:noFill/>
+                      <a:ln>
+                        <a:noFill/>
+                      </a:ln>
+                    </wps:spPr>
+                    <wps:txbx>
+                      <w:txbxContent>
+                        <w:p>
+                          <w:pPr>
+                            <w:spacing w:after="0"/>
+                            <w:rPr>
+                              <w:rFonts w:ascii="Calibri" w:eastAsia="Calibri" w:hAnsi="Calibri" w:cs="Calibri"/>
+                              <w:noProof/>
+                              <w:color w:val="000000"/>
+                              <w:sz w:val="24"/>
+                            </w:rPr>
+                          </w:pPr>
+                          <w:r>
+                            <w:rPr>
+                              <w:rFonts w:ascii="Calibri" w:eastAsia="Calibri" w:hAnsi="Calibri" w:cs="Calibri"/>
+                              <w:noProof/>
+                              <w:color w:val="000000"/>
+                              <w:sz w:val="24"/>
+                            </w:rPr>
+                            <w:t>Unclassified - Non-Classifié</w:t>
+                          </w:r>
+                        </w:p>
+                      </w:txbxContent>
+                    </wps:txbx>
+                    <wps:bodyPr rot="0" spcFirstLastPara="0" vertOverflow="overflow" horzOverflow="overflow" vert="horz" wrap="none" lIns="0" tIns="190500" rIns="254000" bIns="0" numCol="1" spcCol="0" rtlCol="0" fromWordArt="0" anchor="t" anchorCtr="0" forceAA="0" compatLnSpc="1">
+                      <a:prstTxWarp prst="textNoShape">
+                        <a:avLst/>
+                      </a:prstTxWarp>
+                      <a:spAutoFit/>
+                    </wps:bodyPr>
+                  </wps:wsp>
+                </a:graphicData>
+              </a:graphic>
+            </wp:anchor>
+          </w:drawing>
+        </mc:Choice>
+        <mc:Fallback>
+          <w:pict>
+            <v:shapetype w14:anchorId="27931B58" id="_x0000_t202" coordsize="21600,21600" o:spt="202" path="m,l,21600r21600,l21600,xe">
+              <v:stroke joinstyle="miter"/>
+              <v:path gradientshapeok="t" o:connecttype="rect"/>
+            </v:shapetype>
+            <v:shape id="Text Box 2" o:spid="_x0000_s1026" type="#_x0000_t202" alt="Unclassified - Non-Classifié" style="position:absolute;margin-left:111pt;margin-top:0;width:151pt;height:29.65pt;z-index:251659264;visibility:visible;mso-wrap-style:none;mso-wrap-distance-left:0;mso-wrap-distance-top:0;mso-wrap-distance-right:0;mso-wrap-distance-bottom:0;mso-position-horizontal:right;mso-position-horizontal-relative:page;mso-position-vertical:top;mso-position-vertical-relative:page;v-text-anchor:top" o:gfxdata="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" filled="f" stroked="f">
+              <v:fill o:detectmouseclick="t"/>
+              <v:textbox style="mso-fit-shape-to-text:t" inset="0,15pt,20pt,0">
+                <w:txbxContent>
+                  <w:p>
+                    <w:pPr>
+                      <w:spacing w:after="0"/>
+                      <w:rPr>
+                        <w:rFonts w:ascii="Calibri" w:eastAsia="Calibri" w:hAnsi="Calibri" w:cs="Calibri"/>
+                        <w:noProof/>
+                        <w:color w:val="000000"/>
+                        <w:sz w:val="24"/>
+                      </w:rPr>
+                    </w:pPr>
+                    <w:r>
+                      <w:rPr>
+                        <w:rFonts w:ascii="Calibri" w:eastAsia="Calibri" w:hAnsi="Calibri" w:cs="Calibri"/>
+                        <w:noProof/>
+                        <w:color w:val="000000"/>
+                        <w:sz w:val="24"/>
+                      </w:rPr>
+                      <w:t>Unclassified - Non-Classifié</w:t>
+                    </w:r>
+                  </w:p>
+                </w:txbxContent>
+              </v:textbox>
+              <w10:wrap anchorx="page" anchory="page"/>
+            </v:shape>
+          </w:pict>
+        </mc:Fallback>
+      </mc:AlternateContent>
+    </w:r>
+  </w:p>
+</w:hdr>
+</file>
+
+<file path=word/header2.xml><?xml version="1.0" encoding="utf-8"?>
+<w:hdr xmlns:wpc="http://schemas.microsoft.com/office/word/2010/wordprocessingCanvas" xmlns:cx="http://schemas.microsoft.com/office/drawing/2014/chartex" xmlns:cx1="http://schemas.microsoft.com/office/drawing/2015/9/8/chartex" xmlns:cx2="http://schemas.microsoft.com/office/drawing/2015/10/21/chartex" xmlns:cx3="http://schemas.microsoft.com/office/drawing/2016/5/9/chartex" xmlns:cx4="http://schemas.microsoft.com/office/drawing/2016/5/10/chartex" xmlns:cx5="http://schemas.microsoft.com/office/drawing/2016/5/11/chartex" xmlns:cx6="http://schemas.microsoft.com/office/drawing/2016/5/12/chartex" xmlns:cx7="http://schemas.microsoft.com/office/drawing/2016/5/13/chartex" xmlns:cx8="http://schemas.microsoft.com/office/drawing/2016/5/14/chartex" xmlns:mc="http://schemas.openxmlformats.org/markup-compatibility/2006" xmlns:aink="http://schemas.microsoft.com/office/drawing/2016/ink" xmlns:am3d="http://schemas.microsoft.com/office/drawing/2017/model3d" xmlns:o="urn:schemas-microsoft-com:office:office" xmlns:oel="http://schemas.microsoft.com/office/2019/extlst" xmlns:r="http://schemas.openxmlformats.org/officeDocument/2006/relationships" xmlns:m="http://schemas.openxmlformats.org/officeDocument/2006/math" xmlns:v="urn:schemas-microsoft-com:vml" xmlns:wp14="http://schemas.microsoft.com/office/word/2010/wordprocessingDrawing" xmlns:wp="http://schemas.openxmlformats.org/drawingml/2006/wordprocessingDrawing" xmlns:w10="urn:schemas-microsoft-com:office:word" xmlns:w="http://schemas.openxmlformats.org/wordprocessingml/2006/main" xmlns:w14="http://schemas.microsoft.com/office/word/2010/wordml" xmlns:w15="http://schemas.microsoft.com/office/word/2012/wordml" xmlns:w16cex="http://schemas.microsoft.com/office/word/2018/wordml/cex" xmlns:w16cid="http://schemas.microsoft.com/office/word/2016/wordml/cid" xmlns:w16="http://schemas.microsoft.com/office/word/2018/wordml" xmlns:w16du="http://schemas.microsoft.com/office/word/2023/wordml/word16du" xmlns:w16sdtdh="http://schemas.microsoft.com/office/word/2020/wordml/sdtdatahash" xmlns:w16sdtfl="http://schemas.microsoft.com/office/word/2024/wordml/sdtformatlock" xmlns:w16se="http://schemas.microsoft.com/office/word/2015/wordml/symex" xmlns:wpg="http://schemas.microsoft.com/office/word/2010/wordprocessingGroup" xmlns:wpi="http://schemas.microsoft.com/office/word/2010/wordprocessingInk" xmlns:wne="http://schemas.microsoft.com/office/word/2006/wordml" xmlns:wps="http://schemas.microsoft.com/office/word/2010/wordprocessingShape" mc:Ignorable="w14 w15 w16se w16cid w16 w16cex w16sdtdh w16sdtfl w16du wp14">
+  <w:p>
+    <w:pPr>
+      <w:pStyle w:val="Header"/>
+      <w:jc w:val="center"/>
+      <w:rPr>
+        <w:sz w:val="18"/>
+      </w:rPr>
+    </w:pPr>
+    <w:r>
+      <w:rPr>
+        <w:noProof/>
+      </w:rPr>
+      <mc:AlternateContent>
+        <mc:Choice Requires="wps">
+          <w:drawing>
+            <wp:anchor distT="0" distB="0" distL="0" distR="0" simplePos="0" relativeHeight="251660288" behindDoc="0" locked="0" layoutInCell="1" allowOverlap="1" wp14:anchorId="00B1F674" wp14:editId="7EED8705">
+              <wp:simplePos x="635" y="635"/>
+              <wp:positionH relativeFrom="page">
+                <wp:align>right</wp:align>
+              </wp:positionH>
+              <wp:positionV relativeFrom="page">
+                <wp:align>top</wp:align>
+              </wp:positionV>
+              <wp:extent cx="1917700" cy="376555"/>
+              <wp:effectExtent l="0" t="0" r="0" b="4445"/>
+              <wp:wrapNone/>
+              <wp:docPr id="1191105273" name="Text Box 3" descr="Unclassified - Non-Classifié">
+                <a:extLst xmlns:a="http://schemas.openxmlformats.org/drawingml/2006/main">
+                  <a:ext uri="{5AE41FA2-C0FF-4470-9BD4-5FADCA87CBE2}">
+                    <aclsh:classification xmlns:aclsh="http://schemas.microsoft.com/office/drawing/2020/classificationShape" classificationOutcomeType="hdr"/>
+                  </a:ext>
+                </a:extLst>
+              </wp:docPr>
+              <wp:cNvGraphicFramePr/>
+              <a:graphic xmlns:a="http://schemas.openxmlformats.org/drawingml/2006/main">
+                <a:graphicData uri="http://schemas.microsoft.com/office/word/2010/wordprocessingShape">
+                  <wps:wsp>
+                    <wps:cNvSpPr txBox="1"/>
+                    <wps:spPr>
+                      <a:xfrm>
+                        <a:off x="0" y="0"/>
+                        <a:ext cx="1917700" cy="376555"/>
+                      </a:xfrm>
+                      <a:prstGeom prst="rect">
+                        <a:avLst/>
+                      </a:prstGeom>
+                      <a:noFill/>
+                      <a:ln>
+                        <a:noFill/>
+                      </a:ln>
+                    </wps:spPr>
+                    <wps:txbx>
+                      <w:txbxContent>
+                        <w:p>
+                          <w:pPr>
+                            <w:spacing w:after="0"/>
+                            <w:rPr>
+                              <w:rFonts w:ascii="Calibri" w:eastAsia="Calibri" w:hAnsi="Calibri" w:cs="Calibri"/>
+                              <w:noProof/>
+                              <w:color w:val="000000"/>
+                              <w:sz w:val="24"/>
+                            </w:rPr>
+                          </w:pPr>
+                          <w:r>
+                            <w:rPr>
+                              <w:rFonts w:ascii="Calibri" w:eastAsia="Calibri" w:hAnsi="Calibri" w:cs="Calibri"/>
+                              <w:noProof/>
+                              <w:color w:val="000000"/>
+                              <w:sz w:val="24"/>
+                            </w:rPr>
+                            <w:t>Unclassified - Non-Classifié</w:t>
+                          </w:r>
+                        </w:p>
+                      </w:txbxContent>
+                    </wps:txbx>
+                    <wps:bodyPr rot="0" spcFirstLastPara="0" vertOverflow="overflow" horzOverflow="overflow" vert="horz" wrap="none" lIns="0" tIns="190500" rIns="254000" bIns="0" numCol="1" spcCol="0" rtlCol="0" fromWordArt="0" anchor="t" anchorCtr="0" forceAA="0" compatLnSpc="1">
+                      <a:prstTxWarp prst="textNoShape">
+                        <a:avLst/>
+                      </a:prstTxWarp>
+                      <a:spAutoFit/>
+                    </wps:bodyPr>
+                  </wps:wsp>
+                </a:graphicData>
+              </a:graphic>
+            </wp:anchor>
+          </w:drawing>
+        </mc:Choice>
+        <mc:Fallback>
+          <w:pict>
+            <v:shapetype w14:anchorId="00B1F674" id="_x0000_t202" coordsize="21600,21600" o:spt="202" path="m,l,21600r21600,l21600,xe">
+              <v:stroke joinstyle="miter"/>
+              <v:path gradientshapeok="t" o:connecttype="rect"/>
+            </v:shapetype>
+            <v:shape id="Text Box 3" o:spid="_x0000_s1027" type="#_x0000_t202" alt="Unclassified - Non-Classifié" style="position:absolute;left:0;text-align:left;margin-left:111pt;margin-top:0;width:151pt;height:29.65pt;z-index:251660288;visibility:visible;mso-wrap-style:none;mso-wrap-distance-left:0;mso-wrap-distance-top:0;mso-wrap-distance-right:0;mso-wrap-distance-bottom:0;mso-position-horizontal:right;mso-position-horizontal-relative:page;mso-position-vertical:top;mso-position-vertical-relative:page;v-text-anchor:top" o:gfxdata="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" filled="f" stroked="f">
+              <v:fill o:detectmouseclick="t"/>
+              <v:textbox style="mso-fit-shape-to-text:t" inset="0,15pt,20pt,0">
+                <w:txbxContent>
+                  <w:p>
+                    <w:pPr>
+                      <w:spacing w:after="0"/>
+                      <w:rPr>
+                        <w:rFonts w:ascii="Calibri" w:eastAsia="Calibri" w:hAnsi="Calibri" w:cs="Calibri"/>
+                        <w:noProof/>
+                        <w:color w:val="000000"/>
+                        <w:sz w:val="24"/>
+                      </w:rPr>
+                    </w:pPr>
+                    <w:r>
+                      <w:rPr>
+                        <w:rFonts w:ascii="Calibri" w:eastAsia="Calibri" w:hAnsi="Calibri" w:cs="Calibri"/>
+                        <w:noProof/>
+                        <w:color w:val="000000"/>
+                        <w:sz w:val="24"/>
+                      </w:rPr>
+                      <w:t>Unclassified - Non-Classifié</w:t>
+                    </w:r>
+                  </w:p>
+                </w:txbxContent>
+              </v:textbox>
+              <w10:wrap anchorx="page" anchory="page"/>
+            </v:shape>
+          </w:pict>
+        </mc:Fallback>
+      </mc:AlternateContent>
+    </w:r>
+  </w:p>
   <w:sdt>
     <w:sdtPr>
       <w:id w:val="754789552"/>
@@ -176,8 +429,135 @@
 </w:hdr>
 </file>
 
+<file path=word/header3.xml><?xml version="1.0" encoding="utf-8"?>
+<w:hdr xmlns:wpc="http://schemas.microsoft.com/office/word/2010/wordprocessingCanvas" xmlns:cx="http://schemas.microsoft.com/office/drawing/2014/chartex" xmlns:cx1="http://schemas.microsoft.com/office/drawing/2015/9/8/chartex" xmlns:cx2="http://schemas.microsoft.com/office/drawing/2015/10/21/chartex" xmlns:cx3="http://schemas.microsoft.com/office/drawing/2016/5/9/chartex" xmlns:cx4="http://schemas.microsoft.com/office/drawing/2016/5/10/chartex" xmlns:cx5="http://schemas.microsoft.com/office/drawing/2016/5/11/chartex" xmlns:cx6="http://schemas.microsoft.com/office/drawing/2016/5/12/chartex" xmlns:cx7="http://schemas.microsoft.com/office/drawing/2016/5/13/chartex" xmlns:cx8="http://schemas.microsoft.com/office/drawing/2016/5/14/chartex" xmlns:mc="http://schemas.openxmlformats.org/markup-compatibility/2006" xmlns:aink="http://schemas.microsoft.com/office/drawing/2016/ink" xmlns:am3d="http://schemas.microsoft.com/office/drawing/2017/model3d" xmlns:o="urn:schemas-microsoft-com:office:office" xmlns:oel="http://schemas.microsoft.com/office/2019/extlst" xmlns:r="http://schemas.openxmlformats.org/officeDocument/2006/relationships" xmlns:m="http://schemas.openxmlformats.org/officeDocument/2006/math" xmlns:v="urn:schemas-microsoft-com:vml" xmlns:wp14="http://schemas.microsoft.com/office/word/2010/wordprocessingDrawing" xmlns:wp="http://schemas.openxmlformats.org/drawingml/2006/wordprocessingDrawing" xmlns:w10="urn:schemas-microsoft-com:office:word" xmlns:w="http://schemas.openxmlformats.org/wordprocessingml/2006/main" xmlns:w14="http://schemas.microsoft.com/office/word/2010/wordml" xmlns:w15="http://schemas.microsoft.com/office/word/2012/wordml" xmlns:w16cex="http://schemas.microsoft.com/office/word/2018/wordml/cex" xmlns:w16cid="http://schemas.microsoft.com/office/word/2016/wordml/cid" xmlns:w16="http://schemas.microsoft.com/office/word/2018/wordml" xmlns:w16du="http://schemas.microsoft.com/office/word/2023/wordml/word16du" xmlns:w16sdtdh="http://schemas.microsoft.com/office/word/2020/wordml/sdtdatahash" xmlns:w16sdtfl="http://schemas.microsoft.com/office/word/2024/wordml/sdtformatlock" xmlns:w16se="http://schemas.microsoft.com/office/word/2015/wordml/symex" xmlns:wpg="http://schemas.microsoft.com/office/word/2010/wordprocessingGroup" xmlns:wpi="http://schemas.microsoft.com/office/word/2010/wordprocessingInk" xmlns:wne="http://schemas.microsoft.com/office/word/2006/wordml" xmlns:wps="http://schemas.microsoft.com/office/word/2010/wordprocessingShape" mc:Ignorable="w14 w15 w16se w16cid w16 w16cex w16sdtdh w16sdtfl w16du wp14">
+  <w:p>
+    <w:pPr>
+      <w:pStyle w:val="Header"/>
+    </w:pPr>
+    <w:r>
+      <w:rPr>
+        <w:noProof/>
+      </w:rPr>
+      <mc:AlternateContent>
+        <mc:Choice Requires="wps">
+          <w:drawing>
+            <wp:anchor distT="0" distB="0" distL="0" distR="0" simplePos="0" relativeHeight="251658240" behindDoc="0" locked="0" layoutInCell="1" allowOverlap="1" wp14:anchorId="7D64293C" wp14:editId="287978B3">
+              <wp:simplePos x="914400" y="457200"/>
+              <wp:positionH relativeFrom="page">
+                <wp:align>right</wp:align>
+              </wp:positionH>
+              <wp:positionV relativeFrom="page">
+                <wp:align>top</wp:align>
+              </wp:positionV>
+              <wp:extent cx="1917700" cy="376555"/>
+              <wp:effectExtent l="0" t="0" r="0" b="4445"/>
+              <wp:wrapNone/>
+              <wp:docPr id="1985424500" name="Text Box 1" descr="Unclassified - Non-Classifié">
+                <a:extLst xmlns:a="http://schemas.openxmlformats.org/drawingml/2006/main">
+                  <a:ext uri="{5AE41FA2-C0FF-4470-9BD4-5FADCA87CBE2}">
+                    <aclsh:classification xmlns:aclsh="http://schemas.microsoft.com/office/drawing/2020/classificationShape" classificationOutcomeType="hdr"/>
+                  </a:ext>
+                </a:extLst>
+              </wp:docPr>
+              <wp:cNvGraphicFramePr/>
+              <a:graphic xmlns:a="http://schemas.openxmlformats.org/drawingml/2006/main">
+                <a:graphicData uri="http://schemas.microsoft.com/office/word/2010/wordprocessingShape">
+                  <wps:wsp>
+                    <wps:cNvSpPr txBox="1"/>
+                    <wps:spPr>
+                      <a:xfrm>
+                        <a:off x="0" y="0"/>
+                        <a:ext cx="1917700" cy="376555"/>
+                      </a:xfrm>
+                      <a:prstGeom prst="rect">
+                        <a:avLst/>
+                      </a:prstGeom>
+                      <a:noFill/>
+                      <a:ln>
+                        <a:noFill/>
+                      </a:ln>
+                    </wps:spPr>
+                    <wps:txbx>
+                      <w:txbxContent>
+                        <w:p>
+                          <w:pPr>
+                            <w:spacing w:after="0"/>
+                            <w:rPr>
+                              <w:rFonts w:ascii="Calibri" w:eastAsia="Calibri" w:hAnsi="Calibri" w:cs="Calibri"/>
+                              <w:noProof/>
+                              <w:color w:val="000000"/>
+                              <w:sz w:val="24"/>
+                            </w:rPr>
+                          </w:pPr>
+                          <w:r>
+                            <w:rPr>
+                              <w:rFonts w:ascii="Calibri" w:eastAsia="Calibri" w:hAnsi="Calibri" w:cs="Calibri"/>
+                              <w:noProof/>
+                              <w:color w:val="000000"/>
+                              <w:sz w:val="24"/>
+                            </w:rPr>
+                            <w:t>Unclassified - Non-Classifié</w:t>
+                          </w:r>
+                        </w:p>
+                      </w:txbxContent>
+                    </wps:txbx>
+                    <wps:bodyPr rot="0" spcFirstLastPara="0" vertOverflow="overflow" horzOverflow="overflow" vert="horz" wrap="none" lIns="0" tIns="190500" rIns="254000" bIns="0" numCol="1" spcCol="0" rtlCol="0" fromWordArt="0" anchor="t" anchorCtr="0" forceAA="0" compatLnSpc="1">
+                      <a:prstTxWarp prst="textNoShape">
+                        <a:avLst/>
+                      </a:prstTxWarp>
+                      <a:spAutoFit/>
+                    </wps:bodyPr>
+                  </wps:wsp>
+                </a:graphicData>
+              </a:graphic>
+            </wp:anchor>
+          </w:drawing>
+        </mc:Choice>
+        <mc:Fallback>
+          <w:pict>
+            <v:shapetype w14:anchorId="7D64293C" id="_x0000_t202" coordsize="21600,21600" o:spt="202" path="m,l,21600r21600,l21600,xe">
+              <v:stroke joinstyle="miter"/>
+              <v:path gradientshapeok="t" o:connecttype="rect"/>
+            </v:shapetype>
+            <v:shape id="Text Box 1" o:spid="_x0000_s1028" type="#_x0000_t202" alt="Unclassified - Non-Classifié" style="position:absolute;margin-left:111pt;margin-top:0;width:151pt;height:29.65pt;z-index:251658240;visibility:visible;mso-wrap-style:none;mso-wrap-distance-left:0;mso-wrap-distance-top:0;mso-wrap-distance-right:0;mso-wrap-distance-bottom:0;mso-position-horizontal:right;mso-position-horizontal-relative:page;mso-position-vertical:top;mso-position-vertical-relative:page;v-text-anchor:top" o:gfxdata="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" filled="f" stroked="f">
+              <v:fill o:detectmouseclick="t"/>
+              <v:textbox style="mso-fit-shape-to-text:t" inset="0,15pt,20pt,0">
+                <w:txbxContent>
+                  <w:p>
+                    <w:pPr>
+                      <w:spacing w:after="0"/>
+                      <w:rPr>
+                        <w:rFonts w:ascii="Calibri" w:eastAsia="Calibri" w:hAnsi="Calibri" w:cs="Calibri"/>
+                        <w:noProof/>
+                        <w:color w:val="000000"/>
+                        <w:sz w:val="24"/>
+                      </w:rPr>
+                    </w:pPr>
+                    <w:r>
+                      <w:rPr>
+                        <w:rFonts w:ascii="Calibri" w:eastAsia="Calibri" w:hAnsi="Calibri" w:cs="Calibri"/>
+                        <w:noProof/>
+                        <w:color w:val="000000"/>
+                        <w:sz w:val="24"/>
+                      </w:rPr>
+                      <w:t>Unclassified - Non-Classifié</w:t>
+                    </w:r>
+                  </w:p>
+                </w:txbxContent>
+              </v:textbox>
+              <w10:wrap anchorx="page" anchory="page"/>
+            </v:shape>
+          </w:pict>
+        </mc:Fallback>
+      </mc:AlternateContent>
+    </w:r>
+  </w:p>
+</w:hdr>
+</file>
+
 <file path=word/numbering.xml><?xml version="1.0" encoding="utf-8"?>
-<w:numbering xmlns:wpc="http://schemas.microsoft.com/office/word/2010/wordprocessingCanvas" xmlns:cx="http://schemas.microsoft.com/office/drawing/2014/chartex" xmlns:cx1="http://schemas.microsoft.com/office/drawing/2015/9/8/chartex" xmlns:mc="http://schemas.openxmlformats.org/markup-compatibility/2006" xmlns:o="urn:schemas-microsoft-com:office:office" xmlns:r="http://schemas.openxmlformats.org/officeDocument/2006/relationships" xmlns:m="http://schemas.openxmlformats.org/officeDocument/2006/math" xmlns:v="urn:schemas-microsoft-com:vml" xmlns:wp14="http://schemas.microsoft.com/office/word/2010/wordprocessingDrawing" xmlns:wp="http://schemas.openxmlformats.org/drawingml/2006/wordprocessingDrawing" xmlns:w10="urn:schemas-microsoft-com:office:word" xmlns:w="http://schemas.openxmlformats.org/wordprocessingml/2006/main" xmlns:w14="http://schemas.microsoft.com/office/word/2010/wordml" xmlns:w15="http://schemas.microsoft.com/office/word/2012/wordml" xmlns:w16se="http://schemas.microsoft.com/office/word/2015/wordml/symex" xmlns:wpg="http://schemas.microsoft.com/office/word/2010/wordprocessingGroup" xmlns:wpi="http://schemas.microsoft.com/office/word/2010/wordprocessingInk" xmlns:wne="http://schemas.microsoft.com/office/word/2006/wordml" xmlns:wps="http://schemas.microsoft.com/office/word/2010/wordprocessingShape" mc:Ignorable="w14 w15 w16se wp14">
+<w:numbering xmlns:wpc="http://schemas.microsoft.com/office/word/2010/wordprocessingCanvas" xmlns:cx="http://schemas.microsoft.com/office/drawing/2014/chartex" xmlns:cx1="http://schemas.microsoft.com/office/drawing/2015/9/8/chartex" xmlns:cx2="http://schemas.microsoft.com/office/drawing/2015/10/21/chartex" xmlns:cx3="http://schemas.microsoft.com/office/drawing/2016/5/9/chartex" xmlns:cx4="http://schemas.microsoft.com/office/drawing/2016/5/10/chartex" xmlns:cx5="http://schemas.microsoft.com/office/drawing/2016/5/11/chartex" xmlns:cx6="http://schemas.microsoft.com/office/drawing/2016/5/12/chartex" xmlns:cx7="http://schemas.microsoft.com/office/drawing/2016/5/13/chartex" xmlns:cx8="http://schemas.microsoft.com/office/drawing/2016/5/14/chartex" xmlns:mc="http://schemas.openxmlformats.org/markup-compatibility/2006" xmlns:aink="http://schemas.microsoft.com/office/drawing/2016/ink" xmlns:am3d="http://schemas.microsoft.com/office/drawing/2017/model3d" xmlns:o="urn:schemas-microsoft-com:office:office" xmlns:oel="http://schemas.microsoft.com/office/2019/extlst" xmlns:r="http://schemas.openxmlformats.org/officeDocument/2006/relationships" xmlns:m="http://schemas.openxmlformats.org/officeDocument/2006/math" xmlns:v="urn:schemas-microsoft-com:vml" xmlns:wp14="http://schemas.microsoft.com/office/word/2010/wordprocessingDrawing" xmlns:wp="http://schemas.openxmlformats.org/drawingml/2006/wordprocessingDrawing" xmlns:w10="urn:schemas-microsoft-com:office:word" xmlns:w="http://schemas.openxmlformats.org/wordprocessingml/2006/main" xmlns:w14="http://schemas.microsoft.com/office/word/2010/wordml" xmlns:w15="http://schemas.microsoft.com/office/word/2012/wordml" xmlns:w16cex="http://schemas.microsoft.com/office/word/2018/wordml/cex" xmlns:w16cid="http://schemas.microsoft.com/office/word/2016/wordml/cid" xmlns:w16="http://schemas.microsoft.com/office/word/2018/wordml" xmlns:w16du="http://schemas.microsoft.com/office/word/2023/wordml/word16du" xmlns:w16sdtdh="http://schemas.microsoft.com/office/word/2020/wordml/sdtdatahash" xmlns:w16sdtfl="http://schemas.microsoft.com/office/word/2024/wordml/sdtformatlock" xmlns:w16se="http://schemas.microsoft.com/office/word/2015/wordml/symex" xmlns:wpg="http://schemas.microsoft.com/office/word/2010/wordprocessingGroup" xmlns:wpi="http://schemas.microsoft.com/office/word/2010/wordprocessingInk" xmlns:wne="http://schemas.microsoft.com/office/word/2006/wordml" xmlns:wps="http://schemas.microsoft.com/office/word/2010/wordprocessingShape" mc:Ignorable="w14 w15 w16se w16cid w16 w16cex w16sdtdh w16sdtfl w16du wp14">
   <w:abstractNum w:abstractNumId="0" w15:restartNumberingAfterBreak="0">
     <w:nsid w:val="B7761B05"/>
     <w:multiLevelType w:val="multilevel"/>
@@ -1759,83 +2139,83 @@
       </w:pPr>
     </w:lvl>
   </w:abstractNum>
-  <w:num w:numId="1">
+  <w:num w:numId="1" w16cid:durableId="392391140">
     <w:abstractNumId w:val="1"/>
   </w:num>
-  <w:num w:numId="2">
+  <w:num w:numId="2" w16cid:durableId="888884104">
     <w:abstractNumId w:val="0"/>
   </w:num>
-  <w:num w:numId="3">
+  <w:num w:numId="3" w16cid:durableId="1176962158">
     <w:abstractNumId w:val="17"/>
   </w:num>
-  <w:num w:numId="4">
+  <w:num w:numId="4" w16cid:durableId="728187478">
     <w:abstractNumId w:val="16"/>
   </w:num>
-  <w:num w:numId="5">
+  <w:num w:numId="5" w16cid:durableId="2108456184">
     <w:abstractNumId w:val="11"/>
   </w:num>
-  <w:num w:numId="6">
+  <w:num w:numId="6" w16cid:durableId="785194508">
     <w:abstractNumId w:val="9"/>
   </w:num>
-  <w:num w:numId="7">
+  <w:num w:numId="7" w16cid:durableId="724255259">
     <w:abstractNumId w:val="8"/>
   </w:num>
-  <w:num w:numId="8">
+  <w:num w:numId="8" w16cid:durableId="1930119241">
     <w:abstractNumId w:val="7"/>
   </w:num>
-  <w:num w:numId="9">
+  <w:num w:numId="9" w16cid:durableId="2079353872">
     <w:abstractNumId w:val="6"/>
   </w:num>
-  <w:num w:numId="10">
+  <w:num w:numId="10" w16cid:durableId="1975021660">
     <w:abstractNumId w:val="10"/>
   </w:num>
-  <w:num w:numId="11">
+  <w:num w:numId="11" w16cid:durableId="124585985">
     <w:abstractNumId w:val="5"/>
   </w:num>
-  <w:num w:numId="12">
+  <w:num w:numId="12" w16cid:durableId="924414483">
     <w:abstractNumId w:val="4"/>
   </w:num>
-  <w:num w:numId="13">
+  <w:num w:numId="13" w16cid:durableId="364792298">
     <w:abstractNumId w:val="3"/>
   </w:num>
-  <w:num w:numId="14">
+  <w:num w:numId="14" w16cid:durableId="473760200">
     <w:abstractNumId w:val="2"/>
   </w:num>
-  <w:num w:numId="15">
+  <w:num w:numId="15" w16cid:durableId="200631309">
     <w:abstractNumId w:val="14"/>
   </w:num>
-  <w:num w:numId="16">
+  <w:num w:numId="16" w16cid:durableId="1850565074">
     <w:abstractNumId w:val="23"/>
   </w:num>
-  <w:num w:numId="17">
+  <w:num w:numId="17" w16cid:durableId="546256705">
     <w:abstractNumId w:val="21"/>
   </w:num>
-  <w:num w:numId="18">
+  <w:num w:numId="18" w16cid:durableId="2112775136">
     <w:abstractNumId w:val="13"/>
   </w:num>
-  <w:num w:numId="19">
+  <w:num w:numId="19" w16cid:durableId="438112413">
     <w:abstractNumId w:val="15"/>
   </w:num>
-  <w:num w:numId="20">
+  <w:num w:numId="20" w16cid:durableId="1059785214">
     <w:abstractNumId w:val="19"/>
   </w:num>
-  <w:num w:numId="21">
+  <w:num w:numId="21" w16cid:durableId="553463514">
     <w:abstractNumId w:val="22"/>
   </w:num>
-  <w:num w:numId="22">
+  <w:num w:numId="22" w16cid:durableId="2028484372">
     <w:abstractNumId w:val="20"/>
   </w:num>
-  <w:num w:numId="23">
+  <w:num w:numId="23" w16cid:durableId="569508972">
     <w:abstractNumId w:val="18"/>
   </w:num>
-  <w:num w:numId="24">
+  <w:num w:numId="24" w16cid:durableId="563879904">
     <w:abstractNumId w:val="12"/>
   </w:num>
 </w:numbering>
 </file>
 
 <file path=word/styles.xml><?xml version="1.0" encoding="utf-8"?>
-<w:styles xmlns:mc="http://schemas.openxmlformats.org/markup-compatibility/2006" xmlns:r="http://schemas.openxmlformats.org/officeDocument/2006/relationships" xmlns:w="http://schemas.openxmlformats.org/wordprocessingml/2006/main" xmlns:w14="http://schemas.microsoft.com/office/word/2010/wordml" xmlns:w15="http://schemas.microsoft.com/office/word/2012/wordml" xmlns:w16se="http://schemas.microsoft.com/office/word/2015/wordml/symex" mc:Ignorable="w14 w15 w16se">
+<w:styles xmlns:mc="http://schemas.openxmlformats.org/markup-compatibility/2006" xmlns:r="http://schemas.openxmlformats.org/officeDocument/2006/relationships" xmlns:w="http://schemas.openxmlformats.org/wordprocessingml/2006/main" xmlns:w14="http://schemas.microsoft.com/office/word/2010/wordml" xmlns:w15="http://schemas.microsoft.com/office/word/2012/wordml" xmlns:w16cex="http://schemas.microsoft.com/office/word/2018/wordml/cex" xmlns:w16cid="http://schemas.microsoft.com/office/word/2016/wordml/cid" xmlns:w16="http://schemas.microsoft.com/office/word/2018/wordml" xmlns:w16du="http://schemas.microsoft.com/office/word/2023/wordml/word16du" xmlns:w16sdtdh="http://schemas.microsoft.com/office/word/2020/wordml/sdtdatahash" xmlns:w16sdtfl="http://schemas.microsoft.com/office/word/2024/wordml/sdtformatlock" xmlns:w16se="http://schemas.microsoft.com/office/word/2015/wordml/symex" mc:Ignorable="w14 w15 w16se w16cid w16 w16cex w16sdtdh w16sdtfl w16du">
   <w:docDefaults>
     <w:rPrDefault>
       <w:rPr>
@@ -1851,7 +2231,7 @@
       </w:pPr>
     </w:pPrDefault>
   </w:docDefaults>
-  <w:latentStyles w:defLockedState="0" w:defUIPriority="0" w:defSemiHidden="0" w:defUnhideWhenUsed="0" w:defQFormat="0" w:count="371">
+  <w:latentStyles w:defLockedState="0" w:defUIPriority="0" w:defSemiHidden="0" w:defUnhideWhenUsed="0" w:defQFormat="0" w:count="376">
     <w:lsdException w:name="Normal" w:qFormat="1"/>
     <w:lsdException w:name="heading 1" w:qFormat="1"/>
     <w:lsdException w:name="heading 2" w:uiPriority="9" w:qFormat="1"/>
@@ -2214,13 +2594,18 @@
     <w:lsdException w:name="List Table 5 Dark Accent 6" w:uiPriority="50"/>
     <w:lsdException w:name="List Table 6 Colorful Accent 6" w:uiPriority="51"/>
     <w:lsdException w:name="List Table 7 Colorful Accent 6" w:uiPriority="52"/>
+    <w:lsdException w:name="Mention" w:semiHidden="1" w:uiPriority="99" w:unhideWhenUsed="1"/>
+    <w:lsdException w:name="Smart Hyperlink" w:semiHidden="1" w:uiPriority="99" w:unhideWhenUsed="1"/>
+    <w:lsdException w:name="Hashtag" w:semiHidden="1" w:uiPriority="99" w:unhideWhenUsed="1"/>
+    <w:lsdException w:name="Unresolved Mention" w:semiHidden="1" w:uiPriority="99" w:unhideWhenUsed="1"/>
+    <w:lsdException w:name="Smart Link" w:semiHidden="1" w:uiPriority="99" w:unhideWhenUsed="1"/>
   </w:latentStyles>
   <w:style w:type="paragraph" w:default="1" w:styleId="Normal">
     <w:name w:val="Normal"/>
     <w:qFormat/>
-    <w:rsid w:val="00321CC1"/>
-    <w:rPr>
-      <w:sz w:val="22"/>
+    <w:rsid w:val="00DA625B"/>
+    <w:rPr>
+      <w:sz w:val="20"/>
     </w:rPr>
   </w:style>
   <w:style w:type="paragraph" w:styleId="Heading1">
@@ -2345,7 +2730,6 @@
       <w:bCs/>
       <w:i/>
       <w:iCs/>
-      <w:sz w:val="20"/>
       <w:szCs w:val="20"/>
     </w:rPr>
   </w:style>
@@ -2556,7 +2940,6 @@
     </w:pPr>
     <w:rPr>
       <w:rFonts w:ascii="Times New Roman" w:eastAsia="Times New Roman" w:hAnsi="Times New Roman" w:cs="Times New Roman"/>
-      <w:sz w:val="20"/>
       <w:szCs w:val="20"/>
       <w:lang w:val="en-CA"/>
     </w:rPr>
@@ -3445,7 +3828,6 @@
       <w:rFonts w:asciiTheme="majorHAnsi" w:eastAsiaTheme="majorEastAsia" w:hAnsiTheme="majorHAnsi" w:cstheme="majorBidi"/>
       <w:i/>
       <w:iCs/>
-      <w:sz w:val="20"/>
       <w:szCs w:val="20"/>
     </w:rPr>
   </w:style>
@@ -3598,7 +3980,6 @@
     </w:pPr>
     <w:rPr>
       <w:rFonts w:ascii="Times New Roman" w:eastAsia="Times New Roman" w:hAnsi="Times New Roman" w:cs="Times New Roman"/>
-      <w:sz w:val="20"/>
       <w:lang w:val="en-GB"/>
     </w:rPr>
   </w:style>
@@ -3652,7 +4033,6 @@
     </w:pPr>
     <w:rPr>
       <w:rFonts w:ascii="Times New Roman" w:eastAsia="Times New Roman" w:hAnsi="Times New Roman" w:cs="Times New Roman"/>
-      <w:sz w:val="20"/>
       <w:szCs w:val="20"/>
     </w:rPr>
   </w:style>
@@ -4095,6 +4475,21 @@
 </file>
 
 <file path=customXml/item1.xml><?xml version="1.0" encoding="utf-8"?>
+<?mso-contentType ?>
+<FormTemplates xmlns="http://schemas.microsoft.com/sharepoint/v3/contenttype/forms">
+  <Display>DocumentLibraryForm</Display>
+  <Edit>DocumentLibraryForm</Edit>
+  <New>DocumentLibraryForm</New>
+</FormTemplates>
+</file>
+
+<file path=customXml/item2.xml><?xml version="1.0" encoding="utf-8"?>
+<p:properties xmlns:p="http://schemas.microsoft.com/office/2006/metadata/properties" xmlns:xsi="http://www.w3.org/2001/XMLSchema-instance" xmlns:pc="http://schemas.microsoft.com/office/infopath/2007/PartnerControls">
+  <documentManagement/>
+</p:properties>
+</file>
+
+<file path=customXml/item3.xml><?xml version="1.0" encoding="utf-8"?>
 <ct:contentTypeSchema xmlns:ct="http://schemas.microsoft.com/office/2006/metadata/contentType" xmlns:ma="http://schemas.microsoft.com/office/2006/metadata/properties/metaAttributes" ct:_="" ma:_="" ma:contentTypeName="Document" ma:contentTypeID="0x010100ED9A16F791DC374EA2217F12A2846025" ma:contentTypeVersion="0" ma:contentTypeDescription="Create a new document." ma:contentTypeScope="" ma:versionID="25bc423b55e42faa576624b3b1cb062c">
   <xsd:schema xmlns:xsd="http://www.w3.org/2001/XMLSchema" xmlns:xs="http://www.w3.org/2001/XMLSchema" xmlns:p="http://schemas.microsoft.com/office/2006/metadata/properties" targetNamespace="http://schemas.microsoft.com/office/2006/metadata/properties" ma:root="true" ma:fieldsID="1b05d82d297216baf5b26c55225140df">
     <xsd:element name="properties">
@@ -4208,26 +4603,28 @@
 </ct:contentTypeSchema>
 </file>
 
-<file path=customXml/item2.xml><?xml version="1.0" encoding="utf-8"?>
-<p:properties xmlns:p="http://schemas.microsoft.com/office/2006/metadata/properties" xmlns:xsi="http://www.w3.org/2001/XMLSchema-instance" xmlns:pc="http://schemas.microsoft.com/office/infopath/2007/PartnerControls">
-  <documentManagement/>
-</p:properties>
-</file>
-
-<file path=customXml/item3.xml><?xml version="1.0" encoding="utf-8"?>
-<?mso-contentType ?>
-<FormTemplates xmlns="http://schemas.microsoft.com/sharepoint/v3/contenttype/forms">
-  <Display>DocumentLibraryForm</Display>
-  <Edit>DocumentLibraryForm</Edit>
-  <New>DocumentLibraryForm</New>
-</FormTemplates>
-</file>
-
 <file path=customXml/item4.xml><?xml version="1.0" encoding="utf-8"?>
 <b:Sources xmlns:b="http://schemas.openxmlformats.org/officeDocument/2006/bibliography" xmlns="http://schemas.openxmlformats.org/officeDocument/2006/bibliography" SelectedStyle="\APA.XSL" StyleName="APA"/>
 </file>
 
 <file path=customXml/itemProps1.xml><?xml version="1.0" encoding="utf-8"?>
+<ds:datastoreItem xmlns:ds="http://schemas.openxmlformats.org/officeDocument/2006/customXml" ds:itemID="{B5A7F47C-113C-4958-9344-3CBF6A040031}">
+  <ds:schemaRefs>
+    <ds:schemaRef ds:uri="http://schemas.microsoft.com/sharepoint/v3/contenttype/forms"/>
+  </ds:schemaRefs>
+</ds:datastoreItem>
+</file>
+
+<file path=customXml/itemProps2.xml><?xml version="1.0" encoding="utf-8"?>
+<ds:datastoreItem xmlns:ds="http://schemas.openxmlformats.org/officeDocument/2006/customXml" ds:itemID="{E624024D-AE9B-4FEC-AB9F-C35E1B418B0F}">
+  <ds:schemaRefs>
+    <ds:schemaRef ds:uri="http://schemas.microsoft.com/office/2006/metadata/properties"/>
+    <ds:schemaRef ds:uri="http://schemas.microsoft.com/office/infopath/2007/PartnerControls"/>
+  </ds:schemaRefs>
+</ds:datastoreItem>
+</file>
+
+<file path=customXml/itemProps3.xml><?xml version="1.0" encoding="utf-8"?>
 <ds:datastoreItem xmlns:ds="http://schemas.openxmlformats.org/officeDocument/2006/customXml" ds:itemID="{040F9DD3-E7FC-47F2-B049-73F58A290C19}">
   <ds:schemaRefs>
     <ds:schemaRef ds:uri="http://schemas.microsoft.com/office/2006/metadata/contentType"/>
@@ -4243,23 +4640,6 @@
 </ds:datastoreItem>
 </file>
 
-<file path=customXml/itemProps2.xml><?xml version="1.0" encoding="utf-8"?>
-<ds:datastoreItem xmlns:ds="http://schemas.openxmlformats.org/officeDocument/2006/customXml" ds:itemID="{E624024D-AE9B-4FEC-AB9F-C35E1B418B0F}">
-  <ds:schemaRefs>
-    <ds:schemaRef ds:uri="http://schemas.microsoft.com/office/2006/metadata/properties"/>
-    <ds:schemaRef ds:uri="http://schemas.microsoft.com/office/infopath/2007/PartnerControls"/>
-  </ds:schemaRefs>
-</ds:datastoreItem>
-</file>
-
-<file path=customXml/itemProps3.xml><?xml version="1.0" encoding="utf-8"?>
-<ds:datastoreItem xmlns:ds="http://schemas.openxmlformats.org/officeDocument/2006/customXml" ds:itemID="{B5A7F47C-113C-4958-9344-3CBF6A040031}">
-  <ds:schemaRefs>
-    <ds:schemaRef ds:uri="http://schemas.microsoft.com/sharepoint/v3/contenttype/forms"/>
-  </ds:schemaRefs>
-</ds:datastoreItem>
-</file>
-
 <file path=customXml/itemProps4.xml><?xml version="1.0" encoding="utf-8"?>
 <ds:datastoreItem xmlns:ds="http://schemas.openxmlformats.org/officeDocument/2006/customXml" ds:itemID="{0A0BFCB8-56AA-4DCD-941D-5B55C4734C74}">
   <ds:schemaRefs>

</xml_diff>

<commit_message>
One more change of font size from 11 to 10
</commit_message>
<xml_diff>
--- a/inst/docx/SCS_template.docx
+++ b/inst/docx/SCS_template.docx
@@ -205,7 +205,6 @@
               <v:path gradientshapeok="t" o:connecttype="rect"/>
             </v:shapetype>
             <v:shape id="Text Box 2" o:spid="_x0000_s1026" type="#_x0000_t202" alt="Unclassified - Non-Classifié" style="position:absolute;margin-left:111pt;margin-top:0;width:151pt;height:29.65pt;z-index:251659264;visibility:visible;mso-wrap-style:none;mso-wrap-distance-left:0;mso-wrap-distance-top:0;mso-wrap-distance-right:0;mso-wrap-distance-bottom:0;mso-position-horizontal:right;mso-position-horizontal-relative:page;mso-position-vertical:top;mso-position-vertical-relative:page;v-text-anchor:top" o:gfxdata="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" filled="f" stroked="f">
-              <v:fill o:detectmouseclick="t"/>
               <v:textbox style="mso-fit-shape-to-text:t" inset="0,15pt,20pt,0">
                 <w:txbxContent>
                   <w:p>
@@ -336,7 +335,6 @@
               <v:path gradientshapeok="t" o:connecttype="rect"/>
             </v:shapetype>
             <v:shape id="Text Box 3" o:spid="_x0000_s1027" type="#_x0000_t202" alt="Unclassified - Non-Classifié" style="position:absolute;left:0;text-align:left;margin-left:111pt;margin-top:0;width:151pt;height:29.65pt;z-index:251660288;visibility:visible;mso-wrap-style:none;mso-wrap-distance-left:0;mso-wrap-distance-top:0;mso-wrap-distance-right:0;mso-wrap-distance-bottom:0;mso-position-horizontal:right;mso-position-horizontal-relative:page;mso-position-vertical:top;mso-position-vertical-relative:page;v-text-anchor:top" o:gfxdata="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" filled="f" stroked="f">
-              <v:fill o:detectmouseclick="t"/>
               <v:textbox style="mso-fit-shape-to-text:t" inset="0,15pt,20pt,0">
                 <w:txbxContent>
                   <w:p>
@@ -521,7 +519,6 @@
               <v:path gradientshapeok="t" o:connecttype="rect"/>
             </v:shapetype>
             <v:shape id="Text Box 1" o:spid="_x0000_s1028" type="#_x0000_t202" alt="Unclassified - Non-Classifié" style="position:absolute;margin-left:111pt;margin-top:0;width:151pt;height:29.65pt;z-index:251658240;visibility:visible;mso-wrap-style:none;mso-wrap-distance-left:0;mso-wrap-distance-top:0;mso-wrap-distance-right:0;mso-wrap-distance-bottom:0;mso-position-horizontal:right;mso-position-horizontal-relative:page;mso-position-vertical:top;mso-position-vertical-relative:page;v-text-anchor:top" o:gfxdata="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" filled="f" stroked="f">
-              <v:fill o:detectmouseclick="t"/>
               <v:textbox style="mso-fit-shape-to-text:t" inset="0,15pt,20pt,0">
                 <w:txbxContent>
                   <w:p>
@@ -2988,14 +2985,14 @@
     <w:name w:val="Table Caption"/>
     <w:basedOn w:val="Caption"/>
     <w:qFormat/>
-    <w:rsid w:val="004C2A25"/>
+    <w:rsid w:val="003D2BB4"/>
     <w:pPr>
       <w:keepNext/>
       <w:spacing w:before="480" w:after="120"/>
     </w:pPr>
     <w:rPr>
       <w:b w:val="0"/>
-      <w:sz w:val="22"/>
+      <w:sz w:val="20"/>
       <w:lang w:val="fr-FR"/>
     </w:rPr>
   </w:style>
@@ -3003,13 +3000,13 @@
     <w:name w:val="Image Caption"/>
     <w:basedOn w:val="Caption"/>
     <w:qFormat/>
-    <w:rsid w:val="00C23D99"/>
+    <w:rsid w:val="003D2BB4"/>
     <w:pPr>
       <w:spacing w:after="480"/>
     </w:pPr>
     <w:rPr>
       <w:b w:val="0"/>
-      <w:sz w:val="22"/>
+      <w:sz w:val="20"/>
       <w:lang w:val="fr-FR"/>
     </w:rPr>
   </w:style>
@@ -4475,21 +4472,6 @@
 </file>
 
 <file path=customXml/item1.xml><?xml version="1.0" encoding="utf-8"?>
-<?mso-contentType ?>
-<FormTemplates xmlns="http://schemas.microsoft.com/sharepoint/v3/contenttype/forms">
-  <Display>DocumentLibraryForm</Display>
-  <Edit>DocumentLibraryForm</Edit>
-  <New>DocumentLibraryForm</New>
-</FormTemplates>
-</file>
-
-<file path=customXml/item2.xml><?xml version="1.0" encoding="utf-8"?>
-<p:properties xmlns:p="http://schemas.microsoft.com/office/2006/metadata/properties" xmlns:xsi="http://www.w3.org/2001/XMLSchema-instance" xmlns:pc="http://schemas.microsoft.com/office/infopath/2007/PartnerControls">
-  <documentManagement/>
-</p:properties>
-</file>
-
-<file path=customXml/item3.xml><?xml version="1.0" encoding="utf-8"?>
 <ct:contentTypeSchema xmlns:ct="http://schemas.microsoft.com/office/2006/metadata/contentType" xmlns:ma="http://schemas.microsoft.com/office/2006/metadata/properties/metaAttributes" ct:_="" ma:_="" ma:contentTypeName="Document" ma:contentTypeID="0x010100ED9A16F791DC374EA2217F12A2846025" ma:contentTypeVersion="0" ma:contentTypeDescription="Create a new document." ma:contentTypeScope="" ma:versionID="25bc423b55e42faa576624b3b1cb062c">
   <xsd:schema xmlns:xsd="http://www.w3.org/2001/XMLSchema" xmlns:xs="http://www.w3.org/2001/XMLSchema" xmlns:p="http://schemas.microsoft.com/office/2006/metadata/properties" targetNamespace="http://schemas.microsoft.com/office/2006/metadata/properties" ma:root="true" ma:fieldsID="1b05d82d297216baf5b26c55225140df">
     <xsd:element name="properties">
@@ -4603,28 +4585,26 @@
 </ct:contentTypeSchema>
 </file>
 
+<file path=customXml/item2.xml><?xml version="1.0" encoding="utf-8"?>
+<p:properties xmlns:p="http://schemas.microsoft.com/office/2006/metadata/properties" xmlns:xsi="http://www.w3.org/2001/XMLSchema-instance" xmlns:pc="http://schemas.microsoft.com/office/infopath/2007/PartnerControls">
+  <documentManagement/>
+</p:properties>
+</file>
+
+<file path=customXml/item3.xml><?xml version="1.0" encoding="utf-8"?>
+<?mso-contentType ?>
+<FormTemplates xmlns="http://schemas.microsoft.com/sharepoint/v3/contenttype/forms">
+  <Display>DocumentLibraryForm</Display>
+  <Edit>DocumentLibraryForm</Edit>
+  <New>DocumentLibraryForm</New>
+</FormTemplates>
+</file>
+
 <file path=customXml/item4.xml><?xml version="1.0" encoding="utf-8"?>
 <b:Sources xmlns:b="http://schemas.openxmlformats.org/officeDocument/2006/bibliography" xmlns="http://schemas.openxmlformats.org/officeDocument/2006/bibliography" SelectedStyle="\APA.XSL" StyleName="APA"/>
 </file>
 
 <file path=customXml/itemProps1.xml><?xml version="1.0" encoding="utf-8"?>
-<ds:datastoreItem xmlns:ds="http://schemas.openxmlformats.org/officeDocument/2006/customXml" ds:itemID="{B5A7F47C-113C-4958-9344-3CBF6A040031}">
-  <ds:schemaRefs>
-    <ds:schemaRef ds:uri="http://schemas.microsoft.com/sharepoint/v3/contenttype/forms"/>
-  </ds:schemaRefs>
-</ds:datastoreItem>
-</file>
-
-<file path=customXml/itemProps2.xml><?xml version="1.0" encoding="utf-8"?>
-<ds:datastoreItem xmlns:ds="http://schemas.openxmlformats.org/officeDocument/2006/customXml" ds:itemID="{E624024D-AE9B-4FEC-AB9F-C35E1B418B0F}">
-  <ds:schemaRefs>
-    <ds:schemaRef ds:uri="http://schemas.microsoft.com/office/2006/metadata/properties"/>
-    <ds:schemaRef ds:uri="http://schemas.microsoft.com/office/infopath/2007/PartnerControls"/>
-  </ds:schemaRefs>
-</ds:datastoreItem>
-</file>
-
-<file path=customXml/itemProps3.xml><?xml version="1.0" encoding="utf-8"?>
 <ds:datastoreItem xmlns:ds="http://schemas.openxmlformats.org/officeDocument/2006/customXml" ds:itemID="{040F9DD3-E7FC-47F2-B049-73F58A290C19}">
   <ds:schemaRefs>
     <ds:schemaRef ds:uri="http://schemas.microsoft.com/office/2006/metadata/contentType"/>
@@ -4640,6 +4620,23 @@
 </ds:datastoreItem>
 </file>
 
+<file path=customXml/itemProps2.xml><?xml version="1.0" encoding="utf-8"?>
+<ds:datastoreItem xmlns:ds="http://schemas.openxmlformats.org/officeDocument/2006/customXml" ds:itemID="{E624024D-AE9B-4FEC-AB9F-C35E1B418B0F}">
+  <ds:schemaRefs>
+    <ds:schemaRef ds:uri="http://schemas.microsoft.com/office/2006/metadata/properties"/>
+    <ds:schemaRef ds:uri="http://schemas.microsoft.com/office/infopath/2007/PartnerControls"/>
+  </ds:schemaRefs>
+</ds:datastoreItem>
+</file>
+
+<file path=customXml/itemProps3.xml><?xml version="1.0" encoding="utf-8"?>
+<ds:datastoreItem xmlns:ds="http://schemas.openxmlformats.org/officeDocument/2006/customXml" ds:itemID="{B5A7F47C-113C-4958-9344-3CBF6A040031}">
+  <ds:schemaRefs>
+    <ds:schemaRef ds:uri="http://schemas.microsoft.com/sharepoint/v3/contenttype/forms"/>
+  </ds:schemaRefs>
+</ds:datastoreItem>
+</file>
+
 <file path=customXml/itemProps4.xml><?xml version="1.0" encoding="utf-8"?>
 <ds:datastoreItem xmlns:ds="http://schemas.openxmlformats.org/officeDocument/2006/customXml" ds:itemID="{0A0BFCB8-56AA-4DCD-941D-5B55C4734C74}">
   <ds:schemaRefs>

</xml_diff>

<commit_message>
Fix another font issue
</commit_message>
<xml_diff>
--- a/inst/docx/SCS_template.docx
+++ b/inst/docx/SCS_template.docx
@@ -13,9 +13,10 @@
     <w:sectPr>
       <w:headerReference w:type="even" r:id="rId11"/>
       <w:headerReference w:type="default" r:id="rId12"/>
-      <w:footerReference w:type="default" r:id="rId13"/>
-      <w:headerReference w:type="first" r:id="rId14"/>
-      <w:footerReference w:type="first" r:id="rId15"/>
+      <w:footerReference w:type="even" r:id="rId13"/>
+      <w:footerReference w:type="default" r:id="rId14"/>
+      <w:headerReference w:type="first" r:id="rId15"/>
+      <w:footerReference w:type="first" r:id="rId16"/>
       <w:pgSz w:w="12240" w:h="15840"/>
       <w:pgMar w:top="1440" w:right="1440" w:bottom="1440" w:left="1440" w:header="720" w:footer="720" w:gutter="0"/>
       <w:cols w:space="720"/>
@@ -52,6 +53,16 @@
 </file>
 
 <file path=word/footer1.xml><?xml version="1.0" encoding="utf-8"?>
+<w:ftr xmlns:wpc="http://schemas.microsoft.com/office/word/2010/wordprocessingCanvas" xmlns:cx="http://schemas.microsoft.com/office/drawing/2014/chartex" xmlns:cx1="http://schemas.microsoft.com/office/drawing/2015/9/8/chartex" xmlns:cx2="http://schemas.microsoft.com/office/drawing/2015/10/21/chartex" xmlns:cx3="http://schemas.microsoft.com/office/drawing/2016/5/9/chartex" xmlns:cx4="http://schemas.microsoft.com/office/drawing/2016/5/10/chartex" xmlns:cx5="http://schemas.microsoft.com/office/drawing/2016/5/11/chartex" xmlns:cx6="http://schemas.microsoft.com/office/drawing/2016/5/12/chartex" xmlns:cx7="http://schemas.microsoft.com/office/drawing/2016/5/13/chartex" xmlns:cx8="http://schemas.microsoft.com/office/drawing/2016/5/14/chartex" xmlns:mc="http://schemas.openxmlformats.org/markup-compatibility/2006" xmlns:aink="http://schemas.microsoft.com/office/drawing/2016/ink" xmlns:am3d="http://schemas.microsoft.com/office/drawing/2017/model3d" xmlns:o="urn:schemas-microsoft-com:office:office" xmlns:oel="http://schemas.microsoft.com/office/2019/extlst" xmlns:r="http://schemas.openxmlformats.org/officeDocument/2006/relationships" xmlns:m="http://schemas.openxmlformats.org/officeDocument/2006/math" xmlns:v="urn:schemas-microsoft-com:vml" xmlns:wp14="http://schemas.microsoft.com/office/word/2010/wordprocessingDrawing" xmlns:wp="http://schemas.openxmlformats.org/drawingml/2006/wordprocessingDrawing" xmlns:w10="urn:schemas-microsoft-com:office:word" xmlns:w="http://schemas.openxmlformats.org/wordprocessingml/2006/main" xmlns:w14="http://schemas.microsoft.com/office/word/2010/wordml" xmlns:w15="http://schemas.microsoft.com/office/word/2012/wordml" xmlns:w16cex="http://schemas.microsoft.com/office/word/2018/wordml/cex" xmlns:w16cid="http://schemas.microsoft.com/office/word/2016/wordml/cid" xmlns:w16="http://schemas.microsoft.com/office/word/2018/wordml" xmlns:w16du="http://schemas.microsoft.com/office/word/2023/wordml/word16du" xmlns:w16sdtdh="http://schemas.microsoft.com/office/word/2020/wordml/sdtdatahash" xmlns:w16sdtfl="http://schemas.microsoft.com/office/word/2024/wordml/sdtformatlock" xmlns:w16se="http://schemas.microsoft.com/office/word/2015/wordml/symex" xmlns:wpg="http://schemas.microsoft.com/office/word/2010/wordprocessingGroup" xmlns:wpi="http://schemas.microsoft.com/office/word/2010/wordprocessingInk" xmlns:wne="http://schemas.microsoft.com/office/word/2006/wordml" xmlns:wps="http://schemas.microsoft.com/office/word/2010/wordprocessingShape" mc:Ignorable="w14 w15 w16se w16cid w16 w16cex w16sdtdh w16sdtfl w16du wp14">
+  <w:p>
+    <w:pPr>
+      <w:pStyle w:val="Footer"/>
+    </w:pPr>
+  </w:p>
+</w:ftr>
+</file>
+
+<file path=word/footer2.xml><?xml version="1.0" encoding="utf-8"?>
 <w:ftr xmlns:wpc="http://schemas.microsoft.com/office/word/2010/wordprocessingCanvas" xmlns:cx="http://schemas.microsoft.com/office/drawing/2014/chartex" xmlns:cx1="http://schemas.microsoft.com/office/drawing/2015/9/8/chartex" xmlns:cx2="http://schemas.microsoft.com/office/drawing/2015/10/21/chartex" xmlns:cx3="http://schemas.microsoft.com/office/drawing/2016/5/9/chartex" xmlns:cx4="http://schemas.microsoft.com/office/drawing/2016/5/10/chartex" xmlns:cx5="http://schemas.microsoft.com/office/drawing/2016/5/11/chartex" xmlns:cx6="http://schemas.microsoft.com/office/drawing/2016/5/12/chartex" xmlns:cx7="http://schemas.microsoft.com/office/drawing/2016/5/13/chartex" xmlns:cx8="http://schemas.microsoft.com/office/drawing/2016/5/14/chartex" xmlns:mc="http://schemas.openxmlformats.org/markup-compatibility/2006" xmlns:aink="http://schemas.microsoft.com/office/drawing/2016/ink" xmlns:am3d="http://schemas.microsoft.com/office/drawing/2017/model3d" xmlns:o="urn:schemas-microsoft-com:office:office" xmlns:oel="http://schemas.microsoft.com/office/2019/extlst" xmlns:r="http://schemas.openxmlformats.org/officeDocument/2006/relationships" xmlns:m="http://schemas.openxmlformats.org/officeDocument/2006/math" xmlns:v="urn:schemas-microsoft-com:vml" xmlns:wp14="http://schemas.microsoft.com/office/word/2010/wordprocessingDrawing" xmlns:wp="http://schemas.openxmlformats.org/drawingml/2006/wordprocessingDrawing" xmlns:w10="urn:schemas-microsoft-com:office:word" xmlns:w="http://schemas.openxmlformats.org/wordprocessingml/2006/main" xmlns:w14="http://schemas.microsoft.com/office/word/2010/wordml" xmlns:w15="http://schemas.microsoft.com/office/word/2012/wordml" xmlns:w16cex="http://schemas.microsoft.com/office/word/2018/wordml/cex" xmlns:w16cid="http://schemas.microsoft.com/office/word/2016/wordml/cid" xmlns:w16="http://schemas.microsoft.com/office/word/2018/wordml" xmlns:w16du="http://schemas.microsoft.com/office/word/2023/wordml/word16du" xmlns:w16sdtdh="http://schemas.microsoft.com/office/word/2020/wordml/sdtdatahash" xmlns:w16sdtfl="http://schemas.microsoft.com/office/word/2024/wordml/sdtformatlock" xmlns:w16se="http://schemas.microsoft.com/office/word/2015/wordml/symex" xmlns:wpg="http://schemas.microsoft.com/office/word/2010/wordprocessingGroup" xmlns:wpi="http://schemas.microsoft.com/office/word/2010/wordprocessingInk" xmlns:wne="http://schemas.microsoft.com/office/word/2006/wordml" xmlns:wps="http://schemas.microsoft.com/office/word/2010/wordprocessingShape" mc:Ignorable="w14 w15 w16se w16cid w16 w16cex w16sdtdh w16sdtfl w16du wp14">
   <w:p>
     <w:pPr>
@@ -72,7 +83,7 @@
 </w:ftr>
 </file>
 
-<file path=word/footer2.xml><?xml version="1.0" encoding="utf-8"?>
+<file path=word/footer3.xml><?xml version="1.0" encoding="utf-8"?>
 <w:ftr xmlns:wpc="http://schemas.microsoft.com/office/word/2010/wordprocessingCanvas" xmlns:cx="http://schemas.microsoft.com/office/drawing/2014/chartex" xmlns:cx1="http://schemas.microsoft.com/office/drawing/2015/9/8/chartex" xmlns:cx2="http://schemas.microsoft.com/office/drawing/2015/10/21/chartex" xmlns:cx3="http://schemas.microsoft.com/office/drawing/2016/5/9/chartex" xmlns:cx4="http://schemas.microsoft.com/office/drawing/2016/5/10/chartex" xmlns:cx5="http://schemas.microsoft.com/office/drawing/2016/5/11/chartex" xmlns:cx6="http://schemas.microsoft.com/office/drawing/2016/5/12/chartex" xmlns:cx7="http://schemas.microsoft.com/office/drawing/2016/5/13/chartex" xmlns:cx8="http://schemas.microsoft.com/office/drawing/2016/5/14/chartex" xmlns:mc="http://schemas.openxmlformats.org/markup-compatibility/2006" xmlns:aink="http://schemas.microsoft.com/office/drawing/2016/ink" xmlns:am3d="http://schemas.microsoft.com/office/drawing/2017/model3d" xmlns:o="urn:schemas-microsoft-com:office:office" xmlns:oel="http://schemas.microsoft.com/office/2019/extlst" xmlns:r="http://schemas.openxmlformats.org/officeDocument/2006/relationships" xmlns:m="http://schemas.openxmlformats.org/officeDocument/2006/math" xmlns:v="urn:schemas-microsoft-com:vml" xmlns:wp14="http://schemas.microsoft.com/office/word/2010/wordprocessingDrawing" xmlns:wp="http://schemas.openxmlformats.org/drawingml/2006/wordprocessingDrawing" xmlns:w10="urn:schemas-microsoft-com:office:word" xmlns:w="http://schemas.openxmlformats.org/wordprocessingml/2006/main" xmlns:w14="http://schemas.microsoft.com/office/word/2010/wordml" xmlns:w15="http://schemas.microsoft.com/office/word/2012/wordml" xmlns:w16cex="http://schemas.microsoft.com/office/word/2018/wordml/cex" xmlns:w16cid="http://schemas.microsoft.com/office/word/2016/wordml/cid" xmlns:w16="http://schemas.microsoft.com/office/word/2018/wordml" xmlns:w16du="http://schemas.microsoft.com/office/word/2023/wordml/word16du" xmlns:w16sdtdh="http://schemas.microsoft.com/office/word/2020/wordml/sdtdatahash" xmlns:w16sdtfl="http://schemas.microsoft.com/office/word/2024/wordml/sdtformatlock" xmlns:w16se="http://schemas.microsoft.com/office/word/2015/wordml/symex" xmlns:wpg="http://schemas.microsoft.com/office/word/2010/wordprocessingGroup" xmlns:wpi="http://schemas.microsoft.com/office/word/2010/wordprocessingInk" xmlns:wne="http://schemas.microsoft.com/office/word/2006/wordml" xmlns:wps="http://schemas.microsoft.com/office/word/2010/wordprocessingShape" mc:Ignorable="w14 w15 w16se w16cid w16 w16cex w16sdtdh w16sdtfl w16du wp14">
   <w:p>
     <w:pPr>
@@ -433,122 +444,6 @@
     <w:pPr>
       <w:pStyle w:val="Header"/>
     </w:pPr>
-    <w:r>
-      <w:rPr>
-        <w:noProof/>
-      </w:rPr>
-      <mc:AlternateContent>
-        <mc:Choice Requires="wps">
-          <w:drawing>
-            <wp:anchor distT="0" distB="0" distL="0" distR="0" simplePos="0" relativeHeight="251658240" behindDoc="0" locked="0" layoutInCell="1" allowOverlap="1" wp14:anchorId="7D64293C" wp14:editId="287978B3">
-              <wp:simplePos x="914400" y="457200"/>
-              <wp:positionH relativeFrom="page">
-                <wp:align>right</wp:align>
-              </wp:positionH>
-              <wp:positionV relativeFrom="page">
-                <wp:align>top</wp:align>
-              </wp:positionV>
-              <wp:extent cx="1917700" cy="376555"/>
-              <wp:effectExtent l="0" t="0" r="0" b="4445"/>
-              <wp:wrapNone/>
-              <wp:docPr id="1985424500" name="Text Box 1" descr="Unclassified - Non-Classifié">
-                <a:extLst xmlns:a="http://schemas.openxmlformats.org/drawingml/2006/main">
-                  <a:ext uri="{5AE41FA2-C0FF-4470-9BD4-5FADCA87CBE2}">
-                    <aclsh:classification xmlns:aclsh="http://schemas.microsoft.com/office/drawing/2020/classificationShape" classificationOutcomeType="hdr"/>
-                  </a:ext>
-                </a:extLst>
-              </wp:docPr>
-              <wp:cNvGraphicFramePr/>
-              <a:graphic xmlns:a="http://schemas.openxmlformats.org/drawingml/2006/main">
-                <a:graphicData uri="http://schemas.microsoft.com/office/word/2010/wordprocessingShape">
-                  <wps:wsp>
-                    <wps:cNvSpPr txBox="1"/>
-                    <wps:spPr>
-                      <a:xfrm>
-                        <a:off x="0" y="0"/>
-                        <a:ext cx="1917700" cy="376555"/>
-                      </a:xfrm>
-                      <a:prstGeom prst="rect">
-                        <a:avLst/>
-                      </a:prstGeom>
-                      <a:noFill/>
-                      <a:ln>
-                        <a:noFill/>
-                      </a:ln>
-                    </wps:spPr>
-                    <wps:txbx>
-                      <w:txbxContent>
-                        <w:p>
-                          <w:pPr>
-                            <w:spacing w:after="0"/>
-                            <w:rPr>
-                              <w:rFonts w:ascii="Calibri" w:eastAsia="Calibri" w:hAnsi="Calibri" w:cs="Calibri"/>
-                              <w:noProof/>
-                              <w:color w:val="000000"/>
-                              <w:sz w:val="24"/>
-                            </w:rPr>
-                          </w:pPr>
-                          <w:r>
-                            <w:rPr>
-                              <w:rFonts w:ascii="Calibri" w:eastAsia="Calibri" w:hAnsi="Calibri" w:cs="Calibri"/>
-                              <w:noProof/>
-                              <w:color w:val="000000"/>
-                              <w:sz w:val="24"/>
-                            </w:rPr>
-                            <w:t>Unclassified - Non-Classifié</w:t>
-                          </w:r>
-                        </w:p>
-                      </w:txbxContent>
-                    </wps:txbx>
-                    <wps:bodyPr rot="0" spcFirstLastPara="0" vertOverflow="overflow" horzOverflow="overflow" vert="horz" wrap="none" lIns="0" tIns="190500" rIns="254000" bIns="0" numCol="1" spcCol="0" rtlCol="0" fromWordArt="0" anchor="t" anchorCtr="0" forceAA="0" compatLnSpc="1">
-                      <a:prstTxWarp prst="textNoShape">
-                        <a:avLst/>
-                      </a:prstTxWarp>
-                      <a:spAutoFit/>
-                    </wps:bodyPr>
-                  </wps:wsp>
-                </a:graphicData>
-              </a:graphic>
-            </wp:anchor>
-          </w:drawing>
-        </mc:Choice>
-        <mc:Fallback>
-          <w:pict>
-            <v:shapetype w14:anchorId="7D64293C" id="_x0000_t202" coordsize="21600,21600" o:spt="202" path="m,l,21600r21600,l21600,xe">
-              <v:stroke joinstyle="miter"/>
-              <v:path gradientshapeok="t" o:connecttype="rect"/>
-            </v:shapetype>
-            <v:shape id="Text Box 1" o:spid="_x0000_s1028" type="#_x0000_t202" alt="Unclassified - Non-Classifié" style="position:absolute;margin-left:111pt;margin-top:0;width:151pt;height:29.65pt;z-index:251658240;visibility:visible;mso-wrap-style:none;mso-wrap-distance-left:0;mso-wrap-distance-top:0;mso-wrap-distance-right:0;mso-wrap-distance-bottom:0;mso-position-horizontal:right;mso-position-horizontal-relative:page;mso-position-vertical:top;mso-position-vertical-relative:page;v-text-anchor:top" o:gfxdata="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" filled="f" stroked="f">
-              <v:textbox style="mso-fit-shape-to-text:t" inset="0,15pt,20pt,0">
-                <w:txbxContent>
-                  <w:p>
-                    <w:pPr>
-                      <w:spacing w:after="0"/>
-                      <w:rPr>
-                        <w:rFonts w:ascii="Calibri" w:eastAsia="Calibri" w:hAnsi="Calibri" w:cs="Calibri"/>
-                        <w:noProof/>
-                        <w:color w:val="000000"/>
-                        <w:sz w:val="24"/>
-                      </w:rPr>
-                    </w:pPr>
-                    <w:r>
-                      <w:rPr>
-                        <w:rFonts w:ascii="Calibri" w:eastAsia="Calibri" w:hAnsi="Calibri" w:cs="Calibri"/>
-                        <w:noProof/>
-                        <w:color w:val="000000"/>
-                        <w:sz w:val="24"/>
-                      </w:rPr>
-                      <w:t>Unclassified - Non-Classifié</w:t>
-                    </w:r>
-                  </w:p>
-                </w:txbxContent>
-              </v:textbox>
-              <w10:wrap anchorx="page" anchory="page"/>
-            </v:shape>
-          </w:pict>
-        </mc:Fallback>
-      </mc:AlternateContent>
-    </w:r>
   </w:p>
 </w:hdr>
 </file>
@@ -2922,7 +2817,7 @@
     <w:next w:val="BodyText"/>
     <w:unhideWhenUsed/>
     <w:qFormat/>
-    <w:rsid w:val="00FB604B"/>
+    <w:rsid w:val="00DD3942"/>
     <w:pPr>
       <w:pBdr>
         <w:top w:val="single" w:sz="4" w:space="1" w:color="auto"/>
@@ -2936,7 +2831,7 @@
       </w:tabs>
     </w:pPr>
     <w:rPr>
-      <w:rFonts w:ascii="Times New Roman" w:eastAsia="Times New Roman" w:hAnsi="Times New Roman" w:cs="Times New Roman"/>
+      <w:rFonts w:eastAsia="Times New Roman" w:cs="Times New Roman"/>
       <w:szCs w:val="20"/>
       <w:lang w:val="en-CA"/>
     </w:rPr>
@@ -4472,6 +4367,21 @@
 </file>
 
 <file path=customXml/item1.xml><?xml version="1.0" encoding="utf-8"?>
+<?mso-contentType ?>
+<FormTemplates xmlns="http://schemas.microsoft.com/sharepoint/v3/contenttype/forms">
+  <Display>DocumentLibraryForm</Display>
+  <Edit>DocumentLibraryForm</Edit>
+  <New>DocumentLibraryForm</New>
+</FormTemplates>
+</file>
+
+<file path=customXml/item2.xml><?xml version="1.0" encoding="utf-8"?>
+<p:properties xmlns:p="http://schemas.microsoft.com/office/2006/metadata/properties" xmlns:xsi="http://www.w3.org/2001/XMLSchema-instance" xmlns:pc="http://schemas.microsoft.com/office/infopath/2007/PartnerControls">
+  <documentManagement/>
+</p:properties>
+</file>
+
+<file path=customXml/item3.xml><?xml version="1.0" encoding="utf-8"?>
 <ct:contentTypeSchema xmlns:ct="http://schemas.microsoft.com/office/2006/metadata/contentType" xmlns:ma="http://schemas.microsoft.com/office/2006/metadata/properties/metaAttributes" ct:_="" ma:_="" ma:contentTypeName="Document" ma:contentTypeID="0x010100ED9A16F791DC374EA2217F12A2846025" ma:contentTypeVersion="0" ma:contentTypeDescription="Create a new document." ma:contentTypeScope="" ma:versionID="25bc423b55e42faa576624b3b1cb062c">
   <xsd:schema xmlns:xsd="http://www.w3.org/2001/XMLSchema" xmlns:xs="http://www.w3.org/2001/XMLSchema" xmlns:p="http://schemas.microsoft.com/office/2006/metadata/properties" targetNamespace="http://schemas.microsoft.com/office/2006/metadata/properties" ma:root="true" ma:fieldsID="1b05d82d297216baf5b26c55225140df">
     <xsd:element name="properties">
@@ -4585,26 +4495,28 @@
 </ct:contentTypeSchema>
 </file>
 
-<file path=customXml/item2.xml><?xml version="1.0" encoding="utf-8"?>
-<p:properties xmlns:p="http://schemas.microsoft.com/office/2006/metadata/properties" xmlns:xsi="http://www.w3.org/2001/XMLSchema-instance" xmlns:pc="http://schemas.microsoft.com/office/infopath/2007/PartnerControls">
-  <documentManagement/>
-</p:properties>
-</file>
-
-<file path=customXml/item3.xml><?xml version="1.0" encoding="utf-8"?>
-<?mso-contentType ?>
-<FormTemplates xmlns="http://schemas.microsoft.com/sharepoint/v3/contenttype/forms">
-  <Display>DocumentLibraryForm</Display>
-  <Edit>DocumentLibraryForm</Edit>
-  <New>DocumentLibraryForm</New>
-</FormTemplates>
-</file>
-
 <file path=customXml/item4.xml><?xml version="1.0" encoding="utf-8"?>
 <b:Sources xmlns:b="http://schemas.openxmlformats.org/officeDocument/2006/bibliography" xmlns="http://schemas.openxmlformats.org/officeDocument/2006/bibliography" SelectedStyle="\APA.XSL" StyleName="APA"/>
 </file>
 
 <file path=customXml/itemProps1.xml><?xml version="1.0" encoding="utf-8"?>
+<ds:datastoreItem xmlns:ds="http://schemas.openxmlformats.org/officeDocument/2006/customXml" ds:itemID="{B5A7F47C-113C-4958-9344-3CBF6A040031}">
+  <ds:schemaRefs>
+    <ds:schemaRef ds:uri="http://schemas.microsoft.com/sharepoint/v3/contenttype/forms"/>
+  </ds:schemaRefs>
+</ds:datastoreItem>
+</file>
+
+<file path=customXml/itemProps2.xml><?xml version="1.0" encoding="utf-8"?>
+<ds:datastoreItem xmlns:ds="http://schemas.openxmlformats.org/officeDocument/2006/customXml" ds:itemID="{E624024D-AE9B-4FEC-AB9F-C35E1B418B0F}">
+  <ds:schemaRefs>
+    <ds:schemaRef ds:uri="http://schemas.microsoft.com/office/2006/metadata/properties"/>
+    <ds:schemaRef ds:uri="http://schemas.microsoft.com/office/infopath/2007/PartnerControls"/>
+  </ds:schemaRefs>
+</ds:datastoreItem>
+</file>
+
+<file path=customXml/itemProps3.xml><?xml version="1.0" encoding="utf-8"?>
 <ds:datastoreItem xmlns:ds="http://schemas.openxmlformats.org/officeDocument/2006/customXml" ds:itemID="{040F9DD3-E7FC-47F2-B049-73F58A290C19}">
   <ds:schemaRefs>
     <ds:schemaRef ds:uri="http://schemas.microsoft.com/office/2006/metadata/contentType"/>
@@ -4620,23 +4532,6 @@
 </ds:datastoreItem>
 </file>
 
-<file path=customXml/itemProps2.xml><?xml version="1.0" encoding="utf-8"?>
-<ds:datastoreItem xmlns:ds="http://schemas.openxmlformats.org/officeDocument/2006/customXml" ds:itemID="{E624024D-AE9B-4FEC-AB9F-C35E1B418B0F}">
-  <ds:schemaRefs>
-    <ds:schemaRef ds:uri="http://schemas.microsoft.com/office/2006/metadata/properties"/>
-    <ds:schemaRef ds:uri="http://schemas.microsoft.com/office/infopath/2007/PartnerControls"/>
-  </ds:schemaRefs>
-</ds:datastoreItem>
-</file>
-
-<file path=customXml/itemProps3.xml><?xml version="1.0" encoding="utf-8"?>
-<ds:datastoreItem xmlns:ds="http://schemas.openxmlformats.org/officeDocument/2006/customXml" ds:itemID="{B5A7F47C-113C-4958-9344-3CBF6A040031}">
-  <ds:schemaRefs>
-    <ds:schemaRef ds:uri="http://schemas.microsoft.com/sharepoint/v3/contenttype/forms"/>
-  </ds:schemaRefs>
-</ds:datastoreItem>
-</file>
-
 <file path=customXml/itemProps4.xml><?xml version="1.0" encoding="utf-8"?>
 <ds:datastoreItem xmlns:ds="http://schemas.openxmlformats.org/officeDocument/2006/customXml" ds:itemID="{0A0BFCB8-56AA-4DCD-941D-5B55C4734C74}">
   <ds:schemaRefs>

</xml_diff>

<commit_message>
Edit template to enable summary sheet style title
</commit_message>
<xml_diff>
--- a/inst/docx/SCS_template.docx
+++ b/inst/docx/SCS_template.docx
@@ -4,7 +4,63 @@
   <w:body>
     <w:p>
       <w:pPr>
-        <w:pStyle w:val="Figure"/>
+        <w:pStyle w:val="Title"/>
+      </w:pPr>
+      <w:r>
+        <w:rPr>
+          <w:b/>
+          <w:bCs/>
+        </w:rPr>
+        <w:t xml:space="preserve">Species X </w:t>
+      </w:r>
+      <w:proofErr w:type="spellStart"/>
+      <w:r>
+        <w:rPr>
+          <w:b/>
+          <w:bCs/>
+        </w:rPr>
+        <w:t>Divs</w:t>
+      </w:r>
+      <w:proofErr w:type="spellEnd"/>
+      <w:r>
+        <w:rPr>
+          <w:b/>
+          <w:bCs/>
+        </w:rPr>
+        <w:t>. Y</w:t>
+      </w:r>
+      <w:r>
+        <w:tab/>
+        <w:t>Advice XXXX for YYYY</w:t>
+      </w:r>
+    </w:p>
+    <w:p>
+      <w:pPr>
+        <w:pStyle w:val="BlockText"/>
+        <w:rPr>
+          <w:b/>
+          <w:bCs/>
+        </w:rPr>
+      </w:pPr>
+      <w:r>
+        <w:rPr>
+          <w:b/>
+          <w:bCs/>
+        </w:rPr>
+        <w:t>Recommendation for 2027</w:t>
+      </w:r>
+    </w:p>
+    <w:p>
+      <w:pPr>
+        <w:pStyle w:val="BlockText"/>
+      </w:pPr>
+      <w:r>
+        <w:t>Scientific Council …</w:t>
+      </w:r>
+    </w:p>
+    <w:p>
+      <w:pPr>
+        <w:pStyle w:val="BodyText"/>
         <w:rPr>
           <w:lang w:val="en-CA"/>
         </w:rPr>
@@ -2672,7 +2728,6 @@
   <w:style w:type="character" w:default="1" w:styleId="DefaultParagraphFont">
     <w:name w:val="Default Paragraph Font"/>
     <w:uiPriority w:val="1"/>
-    <w:semiHidden/>
     <w:unhideWhenUsed/>
   </w:style>
   <w:style w:type="table" w:default="1" w:styleId="TableNormal">
@@ -2729,18 +2784,17 @@
     <w:next w:val="BodyText"/>
     <w:link w:val="TitleChar"/>
     <w:qFormat/>
-    <w:rsid w:val="00E7345E"/>
+    <w:rsid w:val="003E113E"/>
     <w:pPr>
-      <w:keepNext/>
-      <w:keepLines/>
-      <w:spacing w:before="480" w:after="240"/>
-      <w:jc w:val="center"/>
+      <w:pBdr>
+        <w:bottom w:val="single" w:sz="12" w:space="6" w:color="A6A6A6" w:themeColor="background1" w:themeShade="A6"/>
+      </w:pBdr>
+      <w:tabs>
+        <w:tab w:val="right" w:pos="9360"/>
+      </w:tabs>
     </w:pPr>
     <w:rPr>
-      <w:rFonts w:eastAsiaTheme="majorEastAsia" w:cstheme="majorBidi"/>
-      <w:b/>
-      <w:bCs/>
-      <w:szCs w:val="22"/>
+      <w:lang w:val="en-CA"/>
     </w:rPr>
   </w:style>
   <w:style w:type="paragraph" w:styleId="Subtitle">
@@ -2817,18 +2871,19 @@
     <w:next w:val="BodyText"/>
     <w:unhideWhenUsed/>
     <w:qFormat/>
-    <w:rsid w:val="00DD3942"/>
+    <w:rsid w:val="0031651F"/>
     <w:pPr>
       <w:pBdr>
-        <w:top w:val="single" w:sz="4" w:space="1" w:color="auto"/>
+        <w:top w:val="single" w:sz="4" w:space="4" w:color="auto"/>
         <w:left w:val="single" w:sz="4" w:space="4" w:color="auto"/>
-        <w:bottom w:val="single" w:sz="4" w:space="1" w:color="auto"/>
+        <w:bottom w:val="single" w:sz="4" w:space="4" w:color="auto"/>
         <w:right w:val="single" w:sz="4" w:space="4" w:color="auto"/>
       </w:pBdr>
       <w:shd w:val="pct15" w:color="auto" w:fill="auto"/>
       <w:tabs>
         <w:tab w:val="left" w:pos="360"/>
       </w:tabs>
+      <w:ind w:left="72" w:right="72"/>
     </w:pPr>
     <w:rPr>
       <w:rFonts w:eastAsia="Times New Roman" w:cs="Times New Roman"/>
@@ -3618,13 +3673,10 @@
     <w:name w:val="Title Char"/>
     <w:basedOn w:val="DefaultParagraphFont"/>
     <w:link w:val="Title"/>
-    <w:rsid w:val="00E7345E"/>
-    <w:rPr>
-      <w:rFonts w:eastAsiaTheme="majorEastAsia" w:cstheme="majorBidi"/>
-      <w:b/>
-      <w:bCs/>
-      <w:sz w:val="22"/>
-      <w:szCs w:val="22"/>
+    <w:rsid w:val="003E113E"/>
+    <w:rPr>
+      <w:sz w:val="20"/>
+      <w:lang w:val="en-CA"/>
     </w:rPr>
   </w:style>
   <w:style w:type="character" w:customStyle="1" w:styleId="SubtitleChar">
@@ -4367,21 +4419,10 @@
 </file>
 
 <file path=customXml/item1.xml><?xml version="1.0" encoding="utf-8"?>
-<?mso-contentType ?>
-<FormTemplates xmlns="http://schemas.microsoft.com/sharepoint/v3/contenttype/forms">
-  <Display>DocumentLibraryForm</Display>
-  <Edit>DocumentLibraryForm</Edit>
-  <New>DocumentLibraryForm</New>
-</FormTemplates>
+<b:Sources xmlns:b="http://schemas.openxmlformats.org/officeDocument/2006/bibliography" xmlns="http://schemas.openxmlformats.org/officeDocument/2006/bibliography" SelectedStyle="\APA.XSL" StyleName="APA"/>
 </file>
 
 <file path=customXml/item2.xml><?xml version="1.0" encoding="utf-8"?>
-<p:properties xmlns:p="http://schemas.microsoft.com/office/2006/metadata/properties" xmlns:xsi="http://www.w3.org/2001/XMLSchema-instance" xmlns:pc="http://schemas.microsoft.com/office/infopath/2007/PartnerControls">
-  <documentManagement/>
-</p:properties>
-</file>
-
-<file path=customXml/item3.xml><?xml version="1.0" encoding="utf-8"?>
 <ct:contentTypeSchema xmlns:ct="http://schemas.microsoft.com/office/2006/metadata/contentType" xmlns:ma="http://schemas.microsoft.com/office/2006/metadata/properties/metaAttributes" ct:_="" ma:_="" ma:contentTypeName="Document" ma:contentTypeID="0x010100ED9A16F791DC374EA2217F12A2846025" ma:contentTypeVersion="0" ma:contentTypeDescription="Create a new document." ma:contentTypeScope="" ma:versionID="25bc423b55e42faa576624b3b1cb062c">
   <xsd:schema xmlns:xsd="http://www.w3.org/2001/XMLSchema" xmlns:xs="http://www.w3.org/2001/XMLSchema" xmlns:p="http://schemas.microsoft.com/office/2006/metadata/properties" targetNamespace="http://schemas.microsoft.com/office/2006/metadata/properties" ma:root="true" ma:fieldsID="1b05d82d297216baf5b26c55225140df">
     <xsd:element name="properties">
@@ -4495,28 +4536,30 @@
 </ct:contentTypeSchema>
 </file>
 
+<file path=customXml/item3.xml><?xml version="1.0" encoding="utf-8"?>
+<p:properties xmlns:p="http://schemas.microsoft.com/office/2006/metadata/properties" xmlns:xsi="http://www.w3.org/2001/XMLSchema-instance" xmlns:pc="http://schemas.microsoft.com/office/infopath/2007/PartnerControls">
+  <documentManagement/>
+</p:properties>
+</file>
+
 <file path=customXml/item4.xml><?xml version="1.0" encoding="utf-8"?>
-<b:Sources xmlns:b="http://schemas.openxmlformats.org/officeDocument/2006/bibliography" xmlns="http://schemas.openxmlformats.org/officeDocument/2006/bibliography" SelectedStyle="\APA.XSL" StyleName="APA"/>
+<?mso-contentType ?>
+<FormTemplates xmlns="http://schemas.microsoft.com/sharepoint/v3/contenttype/forms">
+  <Display>DocumentLibraryForm</Display>
+  <Edit>DocumentLibraryForm</Edit>
+  <New>DocumentLibraryForm</New>
+</FormTemplates>
 </file>
 
 <file path=customXml/itemProps1.xml><?xml version="1.0" encoding="utf-8"?>
-<ds:datastoreItem xmlns:ds="http://schemas.openxmlformats.org/officeDocument/2006/customXml" ds:itemID="{B5A7F47C-113C-4958-9344-3CBF6A040031}">
+<ds:datastoreItem xmlns:ds="http://schemas.openxmlformats.org/officeDocument/2006/customXml" ds:itemID="{0A0BFCB8-56AA-4DCD-941D-5B55C4734C74}">
   <ds:schemaRefs>
-    <ds:schemaRef ds:uri="http://schemas.microsoft.com/sharepoint/v3/contenttype/forms"/>
+    <ds:schemaRef ds:uri="http://schemas.openxmlformats.org/officeDocument/2006/bibliography"/>
   </ds:schemaRefs>
 </ds:datastoreItem>
 </file>
 
 <file path=customXml/itemProps2.xml><?xml version="1.0" encoding="utf-8"?>
-<ds:datastoreItem xmlns:ds="http://schemas.openxmlformats.org/officeDocument/2006/customXml" ds:itemID="{E624024D-AE9B-4FEC-AB9F-C35E1B418B0F}">
-  <ds:schemaRefs>
-    <ds:schemaRef ds:uri="http://schemas.microsoft.com/office/2006/metadata/properties"/>
-    <ds:schemaRef ds:uri="http://schemas.microsoft.com/office/infopath/2007/PartnerControls"/>
-  </ds:schemaRefs>
-</ds:datastoreItem>
-</file>
-
-<file path=customXml/itemProps3.xml><?xml version="1.0" encoding="utf-8"?>
 <ds:datastoreItem xmlns:ds="http://schemas.openxmlformats.org/officeDocument/2006/customXml" ds:itemID="{040F9DD3-E7FC-47F2-B049-73F58A290C19}">
   <ds:schemaRefs>
     <ds:schemaRef ds:uri="http://schemas.microsoft.com/office/2006/metadata/contentType"/>
@@ -4532,10 +4575,19 @@
 </ds:datastoreItem>
 </file>
 
+<file path=customXml/itemProps3.xml><?xml version="1.0" encoding="utf-8"?>
+<ds:datastoreItem xmlns:ds="http://schemas.openxmlformats.org/officeDocument/2006/customXml" ds:itemID="{E624024D-AE9B-4FEC-AB9F-C35E1B418B0F}">
+  <ds:schemaRefs>
+    <ds:schemaRef ds:uri="http://schemas.microsoft.com/office/2006/metadata/properties"/>
+    <ds:schemaRef ds:uri="http://schemas.microsoft.com/office/infopath/2007/PartnerControls"/>
+  </ds:schemaRefs>
+</ds:datastoreItem>
+</file>
+
 <file path=customXml/itemProps4.xml><?xml version="1.0" encoding="utf-8"?>
-<ds:datastoreItem xmlns:ds="http://schemas.openxmlformats.org/officeDocument/2006/customXml" ds:itemID="{0A0BFCB8-56AA-4DCD-941D-5B55C4734C74}">
+<ds:datastoreItem xmlns:ds="http://schemas.openxmlformats.org/officeDocument/2006/customXml" ds:itemID="{B5A7F47C-113C-4958-9344-3CBF6A040031}">
   <ds:schemaRefs>
-    <ds:schemaRef ds:uri="http://schemas.openxmlformats.org/officeDocument/2006/bibliography"/>
+    <ds:schemaRef ds:uri="http://schemas.microsoft.com/sharepoint/v3/contenttype/forms"/>
   </ds:schemaRefs>
 </ds:datastoreItem>
 </file>
</xml_diff>